<commit_message>
(wip) EDT, con planificación y ENT-01
- Incluida la declaración de uso de IA
- Incluido EDT generado por IA
</commit_message>
<xml_diff>
--- a/Docs/Segunda semana/word/Plantilla_declaracion_uso_IA_PGPI_v1.0_2026-10-10.docx
+++ b/Docs/Segunda semana/word/Plantilla_declaracion_uso_IA_PGPI_v1.0_2026-10-10.docx
@@ -4,7 +4,7 @@
   <w:body>
     <w:p>
       <w:pPr>
-        <w:pStyle w:val="Ttulo"/>
+        <w:pStyle w:val="Title"/>
         <w:rPr>
           <w:lang w:val="es-ES"/>
         </w:rPr>
@@ -122,7 +122,7 @@
     </w:p>
     <w:p>
       <w:pPr>
-        <w:pStyle w:val="Ttulo2"/>
+        <w:pStyle w:val="Heading2"/>
         <w:rPr>
           <w:lang w:val="es-ES"/>
         </w:rPr>
@@ -162,7 +162,7 @@
     </w:p>
     <w:p>
       <w:pPr>
-        <w:pStyle w:val="Ttulo2"/>
+        <w:pStyle w:val="Heading2"/>
       </w:pPr>
       <w:r>
         <w:t>Registro de usos</w:t>
@@ -623,19 +623,15 @@
               <w:spacing w:before="60" w:after="60"/>
               <w:rPr>
                 <w:sz w:val="18"/>
+                <w:lang w:val="es-ES"/>
               </w:rPr>
             </w:pPr>
             <w:r>
               <w:rPr>
                 <w:sz w:val="18"/>
+                <w:lang w:val="es-ES"/>
               </w:rPr>
-              <w:t>Carlos Ruiz-Mateos Valdivieso</w:t>
-            </w:r>
-            <w:r>
-              <w:rPr>
-                <w:sz w:val="18"/>
-              </w:rPr>
-              <w:t xml:space="preserve">, </w:t>
+              <w:t xml:space="preserve">Carlos Ruiz-Mateos Valdivieso, </w:t>
             </w:r>
           </w:p>
           <w:p>
@@ -643,11 +639,13 @@
               <w:spacing w:before="60" w:after="60"/>
               <w:rPr>
                 <w:sz w:val="18"/>
+                <w:lang w:val="es-ES"/>
               </w:rPr>
             </w:pPr>
             <w:r>
               <w:rPr>
                 <w:sz w:val="18"/>
+                <w:lang w:val="es-ES"/>
               </w:rPr>
               <w:t>Carlos Vázquez Palomero,</w:t>
             </w:r>
@@ -657,11 +655,13 @@
               <w:spacing w:before="60" w:after="60"/>
               <w:rPr>
                 <w:sz w:val="18"/>
+                <w:lang w:val="es-ES"/>
               </w:rPr>
             </w:pPr>
             <w:r>
               <w:rPr>
                 <w:sz w:val="18"/>
+                <w:lang w:val="es-ES"/>
               </w:rPr>
               <w:t xml:space="preserve">Daniel Salado Hidalgo, </w:t>
             </w:r>
@@ -669,10 +669,14 @@
           <w:p>
             <w:pPr>
               <w:spacing w:before="60" w:after="60"/>
+              <w:rPr>
+                <w:lang w:val="es-ES"/>
+              </w:rPr>
             </w:pPr>
             <w:r>
               <w:rPr>
                 <w:sz w:val="18"/>
+                <w:lang w:val="es-ES"/>
               </w:rPr>
               <w:t>Emilio Metro Álvarez</w:t>
             </w:r>
@@ -948,7 +952,12 @@
                 <w:sz w:val="18"/>
               </w:rPr>
               <w:br/>
-              <w:t>[fecha]</w:t>
+            </w:r>
+            <w:r>
+              <w:rPr>
+                <w:sz w:val="18"/>
+              </w:rPr>
+              <w:t>18/10/2028</w:t>
             </w:r>
           </w:p>
         </w:tc>
@@ -976,12 +985,21 @@
                 <w:lang w:val="es-ES"/>
               </w:rPr>
             </w:pPr>
+            <w:proofErr w:type="spellStart"/>
             <w:r>
               <w:rPr>
                 <w:sz w:val="18"/>
                 <w:lang w:val="es-ES"/>
               </w:rPr>
-              <w:t>[nombre y modelo o versión, si se conoce]</w:t>
+              <w:t>Copilot</w:t>
+            </w:r>
+            <w:proofErr w:type="spellEnd"/>
+            <w:r>
+              <w:rPr>
+                <w:sz w:val="18"/>
+                <w:lang w:val="es-ES"/>
+              </w:rPr>
+              <w:t xml:space="preserve"> MS365</w:t>
             </w:r>
           </w:p>
         </w:tc>
@@ -1014,7 +1032,7 @@
                 <w:sz w:val="18"/>
                 <w:lang w:val="es-ES"/>
               </w:rPr>
-              <w:t>[documento, versión y tarea realizada]</w:t>
+              <w:t>EDT</w:t>
             </w:r>
           </w:p>
         </w:tc>
@@ -1043,7 +1061,21 @@
               <w:rPr>
                 <w:sz w:val="18"/>
               </w:rPr>
-              <w:t>[resultado incorporado]</w:t>
+              <w:t xml:space="preserve">La </w:t>
+            </w:r>
+            <w:proofErr w:type="spellStart"/>
+            <w:r>
+              <w:rPr>
+                <w:sz w:val="18"/>
+              </w:rPr>
+              <w:t>propuesta</w:t>
+            </w:r>
+            <w:proofErr w:type="spellEnd"/>
+            <w:r>
+              <w:rPr>
+                <w:sz w:val="18"/>
+              </w:rPr>
+              <w:t xml:space="preserve"> del EDT</w:t>
             </w:r>
           </w:p>
         </w:tc>
@@ -1076,7 +1108,23 @@
                 <w:sz w:val="18"/>
                 <w:lang w:val="es-ES"/>
               </w:rPr>
-              <w:t>[cambio o descarte y su motivo]</w:t>
+              <w:t xml:space="preserve">Versiones de EDT que no </w:t>
+            </w:r>
+            <w:proofErr w:type="spellStart"/>
+            <w:r>
+              <w:rPr>
+                <w:sz w:val="18"/>
+                <w:lang w:val="es-ES"/>
+              </w:rPr>
+              <w:t>complian</w:t>
+            </w:r>
+            <w:proofErr w:type="spellEnd"/>
+            <w:r>
+              <w:rPr>
+                <w:sz w:val="18"/>
+                <w:lang w:val="es-ES"/>
+              </w:rPr>
+              <w:t xml:space="preserve"> con la definición del Plan de Gestión del alcance</w:t>
             </w:r>
           </w:p>
         </w:tc>
@@ -1105,7 +1153,7 @@
               <w:rPr>
                 <w:sz w:val="18"/>
               </w:rPr>
-              <w:t>[nombre y apellidos]</w:t>
+              <w:t>Francisco Perez</w:t>
             </w:r>
           </w:p>
         </w:tc>
@@ -1113,7 +1161,7 @@
     </w:tbl>
     <w:p>
       <w:pPr>
-        <w:pStyle w:val="Ttulo2"/>
+        <w:pStyle w:val="Heading2"/>
       </w:pPr>
       <w:r>
         <w:t>Firma de la declaración</w:t>
@@ -1241,7 +1289,7 @@
 <w:ftr xmlns:wpc="http://schemas.microsoft.com/office/word/2010/wordprocessingCanvas" xmlns:cx="http://schemas.microsoft.com/office/drawing/2014/chartex" xmlns:cx1="http://schemas.microsoft.com/office/drawing/2015/9/8/chartex" xmlns:cx2="http://schemas.microsoft.com/office/drawing/2015/10/21/chartex" xmlns:cx3="http://schemas.microsoft.com/office/drawing/2016/5/9/chartex" xmlns:cx4="http://schemas.microsoft.com/office/drawing/2016/5/10/chartex" xmlns:cx5="http://schemas.microsoft.com/office/drawing/2016/5/11/chartex" xmlns:cx6="http://schemas.microsoft.com/office/drawing/2016/5/12/chartex" xmlns:cx7="http://schemas.microsoft.com/office/drawing/2016/5/13/chartex" xmlns:cx8="http://schemas.microsoft.com/office/drawing/2016/5/14/chartex" xmlns:mc="http://schemas.openxmlformats.org/markup-compatibility/2006" xmlns:aink="http://schemas.microsoft.com/office/drawing/2016/ink" xmlns:am3d="http://schemas.microsoft.com/office/drawing/2017/model3d" xmlns:o="urn:schemas-microsoft-com:office:office" xmlns:oel="http://schemas.microsoft.com/office/2019/extlst" xmlns:r="http://schemas.openxmlformats.org/officeDocument/2006/relationships" xmlns:m="http://schemas.openxmlformats.org/officeDocument/2006/math" xmlns:v="urn:schemas-microsoft-com:vml" xmlns:wp14="http://schemas.microsoft.com/office/word/2010/wordprocessingDrawing" xmlns:wp="http://schemas.openxmlformats.org/drawingml/2006/wordprocessingDrawing" xmlns:w10="urn:schemas-microsoft-com:office:word" xmlns:w="http://schemas.openxmlformats.org/wordprocessingml/2006/main" xmlns:w14="http://schemas.microsoft.com/office/word/2010/wordml" xmlns:w15="http://schemas.microsoft.com/office/word/2012/wordml" xmlns:w16cex="http://schemas.microsoft.com/office/word/2018/wordml/cex" xmlns:w16cid="http://schemas.microsoft.com/office/word/2016/wordml/cid" xmlns:w16="http://schemas.microsoft.com/office/word/2018/wordml" xmlns:w16du="http://schemas.microsoft.com/office/word/2023/wordml/word16du" xmlns:w16sdtdh="http://schemas.microsoft.com/office/word/2020/wordml/sdtdatahash" xmlns:w16sdtfl="http://schemas.microsoft.com/office/word/2024/wordml/sdtformatlock" xmlns:w16se="http://schemas.microsoft.com/office/word/2015/wordml/symex" xmlns:wpg="http://schemas.microsoft.com/office/word/2010/wordprocessingGroup" xmlns:wpi="http://schemas.microsoft.com/office/word/2010/wordprocessingInk" xmlns:wne="http://schemas.microsoft.com/office/word/2006/wordml" xmlns:wps="http://schemas.microsoft.com/office/word/2010/wordprocessingShape" mc:Ignorable="w14 w15 w16se w16cid w16 w16cex w16sdtdh w16sdtfl w16du wp14">
   <w:p>
     <w:pPr>
-      <w:pStyle w:val="Piedepgina"/>
+      <w:pStyle w:val="Footer"/>
       <w:rPr>
         <w:lang w:val="es-ES"/>
       </w:rPr>
@@ -1325,7 +1373,7 @@
     <w:lvl w:ilvl="0">
       <w:start w:val="1"/>
       <w:numFmt w:val="decimal"/>
-      <w:pStyle w:val="Listaconnmeros3"/>
+      <w:pStyle w:val="ListNumber3"/>
       <w:lvlText w:val="%1."/>
       <w:lvlJc w:val="left"/>
       <w:pPr>
@@ -1343,7 +1391,7 @@
     <w:lvl w:ilvl="0">
       <w:start w:val="1"/>
       <w:numFmt w:val="decimal"/>
-      <w:pStyle w:val="Listaconnmeros2"/>
+      <w:pStyle w:val="ListNumber2"/>
       <w:lvlText w:val="%1."/>
       <w:lvlJc w:val="left"/>
       <w:pPr>
@@ -1381,7 +1429,7 @@
     <w:lvl w:ilvl="0">
       <w:start w:val="1"/>
       <w:numFmt w:val="bullet"/>
-      <w:pStyle w:val="Listaconvietas3"/>
+      <w:pStyle w:val="ListBullet3"/>
       <w:lvlText w:val=""/>
       <w:lvlJc w:val="left"/>
       <w:pPr>
@@ -1402,7 +1450,7 @@
     <w:lvl w:ilvl="0">
       <w:start w:val="1"/>
       <w:numFmt w:val="bullet"/>
-      <w:pStyle w:val="Listaconvietas2"/>
+      <w:pStyle w:val="ListBullet2"/>
       <w:lvlText w:val=""/>
       <w:lvlJc w:val="left"/>
       <w:pPr>
@@ -1423,7 +1471,7 @@
     <w:lvl w:ilvl="0">
       <w:start w:val="1"/>
       <w:numFmt w:val="decimal"/>
-      <w:pStyle w:val="Listaconnmeros"/>
+      <w:pStyle w:val="ListNumber"/>
       <w:lvlText w:val="%1."/>
       <w:lvlJc w:val="left"/>
       <w:pPr>
@@ -1441,7 +1489,7 @@
     <w:lvl w:ilvl="0">
       <w:start w:val="1"/>
       <w:numFmt w:val="bullet"/>
-      <w:pStyle w:val="Listaconvietas"/>
+      <w:pStyle w:val="ListBullet"/>
       <w:lvlText w:val=""/>
       <w:lvlJc w:val="left"/>
       <w:pPr>
@@ -1884,11 +1932,11 @@
       <w:sz w:val="20"/>
     </w:rPr>
   </w:style>
-  <w:style w:type="paragraph" w:styleId="Ttulo1">
+  <w:style w:type="paragraph" w:styleId="Heading1">
     <w:name w:val="heading 1"/>
     <w:basedOn w:val="Normal"/>
     <w:next w:val="Normal"/>
-    <w:link w:val="Ttulo1Car"/>
+    <w:link w:val="Heading1Char"/>
     <w:uiPriority w:val="9"/>
     <w:qFormat/>
     <w:rsid w:val="00FC693F"/>
@@ -1906,11 +1954,11 @@
       <w:szCs w:val="28"/>
     </w:rPr>
   </w:style>
-  <w:style w:type="paragraph" w:styleId="Ttulo2">
+  <w:style w:type="paragraph" w:styleId="Heading2">
     <w:name w:val="heading 2"/>
     <w:basedOn w:val="Normal"/>
     <w:next w:val="Normal"/>
-    <w:link w:val="Ttulo2Car"/>
+    <w:link w:val="Heading2Char"/>
     <w:uiPriority w:val="9"/>
     <w:unhideWhenUsed/>
     <w:qFormat/>
@@ -1929,11 +1977,11 @@
       <w:szCs w:val="26"/>
     </w:rPr>
   </w:style>
-  <w:style w:type="paragraph" w:styleId="Ttulo3">
+  <w:style w:type="paragraph" w:styleId="Heading3">
     <w:name w:val="heading 3"/>
     <w:basedOn w:val="Normal"/>
     <w:next w:val="Normal"/>
-    <w:link w:val="Ttulo3Car"/>
+    <w:link w:val="Heading3Char"/>
     <w:uiPriority w:val="9"/>
     <w:unhideWhenUsed/>
     <w:qFormat/>
@@ -1951,11 +1999,11 @@
       <w:color w:val="4F81BD" w:themeColor="accent1"/>
     </w:rPr>
   </w:style>
-  <w:style w:type="paragraph" w:styleId="Ttulo4">
+  <w:style w:type="paragraph" w:styleId="Heading4">
     <w:name w:val="heading 4"/>
     <w:basedOn w:val="Normal"/>
     <w:next w:val="Normal"/>
-    <w:link w:val="Ttulo4Car"/>
+    <w:link w:val="Heading4Char"/>
     <w:uiPriority w:val="9"/>
     <w:semiHidden/>
     <w:unhideWhenUsed/>
@@ -1976,11 +2024,11 @@
       <w:color w:val="4F81BD" w:themeColor="accent1"/>
     </w:rPr>
   </w:style>
-  <w:style w:type="paragraph" w:styleId="Ttulo5">
+  <w:style w:type="paragraph" w:styleId="Heading5">
     <w:name w:val="heading 5"/>
     <w:basedOn w:val="Normal"/>
     <w:next w:val="Normal"/>
-    <w:link w:val="Ttulo5Car"/>
+    <w:link w:val="Heading5Char"/>
     <w:uiPriority w:val="9"/>
     <w:semiHidden/>
     <w:unhideWhenUsed/>
@@ -1997,11 +2045,11 @@
       <w:color w:val="243F60" w:themeColor="accent1" w:themeShade="7F"/>
     </w:rPr>
   </w:style>
-  <w:style w:type="paragraph" w:styleId="Ttulo6">
+  <w:style w:type="paragraph" w:styleId="Heading6">
     <w:name w:val="heading 6"/>
     <w:basedOn w:val="Normal"/>
     <w:next w:val="Normal"/>
-    <w:link w:val="Ttulo6Car"/>
+    <w:link w:val="Heading6Char"/>
     <w:uiPriority w:val="9"/>
     <w:semiHidden/>
     <w:unhideWhenUsed/>
@@ -2020,11 +2068,11 @@
       <w:color w:val="243F60" w:themeColor="accent1" w:themeShade="7F"/>
     </w:rPr>
   </w:style>
-  <w:style w:type="paragraph" w:styleId="Ttulo7">
+  <w:style w:type="paragraph" w:styleId="Heading7">
     <w:name w:val="heading 7"/>
     <w:basedOn w:val="Normal"/>
     <w:next w:val="Normal"/>
-    <w:link w:val="Ttulo7Car"/>
+    <w:link w:val="Heading7Char"/>
     <w:uiPriority w:val="9"/>
     <w:semiHidden/>
     <w:unhideWhenUsed/>
@@ -2043,11 +2091,11 @@
       <w:color w:val="404040" w:themeColor="text1" w:themeTint="BF"/>
     </w:rPr>
   </w:style>
-  <w:style w:type="paragraph" w:styleId="Ttulo8">
+  <w:style w:type="paragraph" w:styleId="Heading8">
     <w:name w:val="heading 8"/>
     <w:basedOn w:val="Normal"/>
     <w:next w:val="Normal"/>
-    <w:link w:val="Ttulo8Car"/>
+    <w:link w:val="Heading8Char"/>
     <w:uiPriority w:val="9"/>
     <w:semiHidden/>
     <w:unhideWhenUsed/>
@@ -2065,11 +2113,11 @@
       <w:szCs w:val="20"/>
     </w:rPr>
   </w:style>
-  <w:style w:type="paragraph" w:styleId="Ttulo9">
+  <w:style w:type="paragraph" w:styleId="Heading9">
     <w:name w:val="heading 9"/>
     <w:basedOn w:val="Normal"/>
     <w:next w:val="Normal"/>
-    <w:link w:val="Ttulo9Car"/>
+    <w:link w:val="Heading9Char"/>
     <w:uiPriority w:val="9"/>
     <w:semiHidden/>
     <w:unhideWhenUsed/>
@@ -2089,13 +2137,13 @@
       <w:szCs w:val="20"/>
     </w:rPr>
   </w:style>
-  <w:style w:type="character" w:default="1" w:styleId="Fuentedeprrafopredeter">
+  <w:style w:type="character" w:default="1" w:styleId="DefaultParagraphFont">
     <w:name w:val="Default Paragraph Font"/>
     <w:uiPriority w:val="1"/>
     <w:semiHidden/>
     <w:unhideWhenUsed/>
   </w:style>
-  <w:style w:type="table" w:default="1" w:styleId="Tablanormal">
+  <w:style w:type="table" w:default="1" w:styleId="TableNormal">
     <w:name w:val="Normal Table"/>
     <w:uiPriority w:val="99"/>
     <w:semiHidden/>
@@ -2110,16 +2158,16 @@
       </w:tblCellMar>
     </w:tblPr>
   </w:style>
-  <w:style w:type="numbering" w:default="1" w:styleId="Sinlista">
+  <w:style w:type="numbering" w:default="1" w:styleId="NoList">
     <w:name w:val="No List"/>
     <w:uiPriority w:val="99"/>
     <w:semiHidden/>
     <w:unhideWhenUsed/>
   </w:style>
-  <w:style w:type="paragraph" w:styleId="Encabezado">
+  <w:style w:type="paragraph" w:styleId="Header">
     <w:name w:val="header"/>
     <w:basedOn w:val="Normal"/>
-    <w:link w:val="EncabezadoCar"/>
+    <w:link w:val="HeaderChar"/>
     <w:uiPriority w:val="99"/>
     <w:unhideWhenUsed/>
     <w:rsid w:val="00E618BF"/>
@@ -2131,17 +2179,17 @@
       <w:spacing w:after="0" w:line="240" w:lineRule="auto"/>
     </w:pPr>
   </w:style>
-  <w:style w:type="character" w:customStyle="1" w:styleId="EncabezadoCar">
-    <w:name w:val="Encabezado Car"/>
-    <w:basedOn w:val="Fuentedeprrafopredeter"/>
-    <w:link w:val="Encabezado"/>
+  <w:style w:type="character" w:customStyle="1" w:styleId="HeaderChar">
+    <w:name w:val="Header Char"/>
+    <w:basedOn w:val="DefaultParagraphFont"/>
+    <w:link w:val="Header"/>
     <w:uiPriority w:val="99"/>
     <w:rsid w:val="00E618BF"/>
   </w:style>
-  <w:style w:type="paragraph" w:styleId="Piedepgina">
+  <w:style w:type="paragraph" w:styleId="Footer">
     <w:name w:val="footer"/>
     <w:basedOn w:val="Normal"/>
-    <w:link w:val="PiedepginaCar"/>
+    <w:link w:val="FooterChar"/>
     <w:uiPriority w:val="99"/>
     <w:unhideWhenUsed/>
     <w:rsid w:val="00E618BF"/>
@@ -2153,14 +2201,14 @@
       <w:spacing w:after="0" w:line="240" w:lineRule="auto"/>
     </w:pPr>
   </w:style>
-  <w:style w:type="character" w:customStyle="1" w:styleId="PiedepginaCar">
-    <w:name w:val="Pie de página Car"/>
-    <w:basedOn w:val="Fuentedeprrafopredeter"/>
-    <w:link w:val="Piedepgina"/>
+  <w:style w:type="character" w:customStyle="1" w:styleId="FooterChar">
+    <w:name w:val="Footer Char"/>
+    <w:basedOn w:val="DefaultParagraphFont"/>
+    <w:link w:val="Footer"/>
     <w:uiPriority w:val="99"/>
     <w:rsid w:val="00E618BF"/>
   </w:style>
-  <w:style w:type="paragraph" w:styleId="Sinespaciado">
+  <w:style w:type="paragraph" w:styleId="NoSpacing">
     <w:name w:val="No Spacing"/>
     <w:uiPriority w:val="1"/>
     <w:qFormat/>
@@ -2169,10 +2217,10 @@
       <w:spacing w:after="0" w:line="240" w:lineRule="auto"/>
     </w:pPr>
   </w:style>
-  <w:style w:type="character" w:customStyle="1" w:styleId="Ttulo1Car">
-    <w:name w:val="Título 1 Car"/>
-    <w:basedOn w:val="Fuentedeprrafopredeter"/>
-    <w:link w:val="Ttulo1"/>
+  <w:style w:type="character" w:customStyle="1" w:styleId="Heading1Char">
+    <w:name w:val="Heading 1 Char"/>
+    <w:basedOn w:val="DefaultParagraphFont"/>
+    <w:link w:val="Heading1"/>
     <w:uiPriority w:val="9"/>
     <w:rsid w:val="00FC693F"/>
     <w:rPr>
@@ -2184,10 +2232,10 @@
       <w:szCs w:val="28"/>
     </w:rPr>
   </w:style>
-  <w:style w:type="character" w:customStyle="1" w:styleId="Ttulo2Car">
-    <w:name w:val="Título 2 Car"/>
-    <w:basedOn w:val="Fuentedeprrafopredeter"/>
-    <w:link w:val="Ttulo2"/>
+  <w:style w:type="character" w:customStyle="1" w:styleId="Heading2Char">
+    <w:name w:val="Heading 2 Char"/>
+    <w:basedOn w:val="DefaultParagraphFont"/>
+    <w:link w:val="Heading2"/>
     <w:uiPriority w:val="9"/>
     <w:rsid w:val="00FC693F"/>
     <w:rPr>
@@ -2199,10 +2247,10 @@
       <w:szCs w:val="26"/>
     </w:rPr>
   </w:style>
-  <w:style w:type="character" w:customStyle="1" w:styleId="Ttulo3Car">
-    <w:name w:val="Título 3 Car"/>
-    <w:basedOn w:val="Fuentedeprrafopredeter"/>
-    <w:link w:val="Ttulo3"/>
+  <w:style w:type="character" w:customStyle="1" w:styleId="Heading3Char">
+    <w:name w:val="Heading 3 Char"/>
+    <w:basedOn w:val="DefaultParagraphFont"/>
+    <w:link w:val="Heading3"/>
     <w:uiPriority w:val="9"/>
     <w:rsid w:val="00FC693F"/>
     <w:rPr>
@@ -2212,11 +2260,11 @@
       <w:color w:val="4F81BD" w:themeColor="accent1"/>
     </w:rPr>
   </w:style>
-  <w:style w:type="paragraph" w:styleId="Ttulo">
+  <w:style w:type="paragraph" w:styleId="Title">
     <w:name w:val="Title"/>
     <w:basedOn w:val="Normal"/>
     <w:next w:val="Normal"/>
-    <w:link w:val="TtuloCar"/>
+    <w:link w:val="TitleChar"/>
     <w:uiPriority w:val="10"/>
     <w:qFormat/>
     <w:rsid w:val="00FC693F"/>
@@ -2232,10 +2280,10 @@
       <w:szCs w:val="52"/>
     </w:rPr>
   </w:style>
-  <w:style w:type="character" w:customStyle="1" w:styleId="TtuloCar">
-    <w:name w:val="Título Car"/>
-    <w:basedOn w:val="Fuentedeprrafopredeter"/>
-    <w:link w:val="Ttulo"/>
+  <w:style w:type="character" w:customStyle="1" w:styleId="TitleChar">
+    <w:name w:val="Title Char"/>
+    <w:basedOn w:val="DefaultParagraphFont"/>
+    <w:link w:val="Title"/>
     <w:uiPriority w:val="10"/>
     <w:rsid w:val="00FC693F"/>
     <w:rPr>
@@ -2247,11 +2295,11 @@
       <w:szCs w:val="52"/>
     </w:rPr>
   </w:style>
-  <w:style w:type="paragraph" w:styleId="Subttulo">
+  <w:style w:type="paragraph" w:styleId="Subtitle">
     <w:name w:val="Subtitle"/>
     <w:basedOn w:val="Normal"/>
     <w:next w:val="Normal"/>
-    <w:link w:val="SubttuloCar"/>
+    <w:link w:val="SubtitleChar"/>
     <w:uiPriority w:val="11"/>
     <w:qFormat/>
     <w:rsid w:val="00FC693F"/>
@@ -2270,10 +2318,10 @@
       <w:szCs w:val="24"/>
     </w:rPr>
   </w:style>
-  <w:style w:type="character" w:customStyle="1" w:styleId="SubttuloCar">
-    <w:name w:val="Subtítulo Car"/>
-    <w:basedOn w:val="Fuentedeprrafopredeter"/>
-    <w:link w:val="Subttulo"/>
+  <w:style w:type="character" w:customStyle="1" w:styleId="SubtitleChar">
+    <w:name w:val="Subtitle Char"/>
+    <w:basedOn w:val="DefaultParagraphFont"/>
+    <w:link w:val="Subtitle"/>
     <w:uiPriority w:val="11"/>
     <w:rsid w:val="00FC693F"/>
     <w:rPr>
@@ -2286,7 +2334,7 @@
       <w:szCs w:val="24"/>
     </w:rPr>
   </w:style>
-  <w:style w:type="paragraph" w:styleId="Prrafodelista">
+  <w:style w:type="paragraph" w:styleId="ListParagraph">
     <w:name w:val="List Paragraph"/>
     <w:basedOn w:val="Normal"/>
     <w:uiPriority w:val="34"/>
@@ -2297,25 +2345,25 @@
       <w:contextualSpacing/>
     </w:pPr>
   </w:style>
-  <w:style w:type="paragraph" w:styleId="Textoindependiente">
+  <w:style w:type="paragraph" w:styleId="BodyText">
     <w:name w:val="Body Text"/>
     <w:basedOn w:val="Normal"/>
-    <w:link w:val="TextoindependienteCar"/>
+    <w:link w:val="BodyTextChar"/>
     <w:uiPriority w:val="99"/>
     <w:unhideWhenUsed/>
     <w:rsid w:val="00AA1D8D"/>
   </w:style>
-  <w:style w:type="character" w:customStyle="1" w:styleId="TextoindependienteCar">
-    <w:name w:val="Texto independiente Car"/>
-    <w:basedOn w:val="Fuentedeprrafopredeter"/>
-    <w:link w:val="Textoindependiente"/>
+  <w:style w:type="character" w:customStyle="1" w:styleId="BodyTextChar">
+    <w:name w:val="Body Text Char"/>
+    <w:basedOn w:val="DefaultParagraphFont"/>
+    <w:link w:val="BodyText"/>
     <w:uiPriority w:val="99"/>
     <w:rsid w:val="00AA1D8D"/>
   </w:style>
-  <w:style w:type="paragraph" w:styleId="Textoindependiente2">
+  <w:style w:type="paragraph" w:styleId="BodyText2">
     <w:name w:val="Body Text 2"/>
     <w:basedOn w:val="Normal"/>
-    <w:link w:val="Textoindependiente2Car"/>
+    <w:link w:val="BodyText2Char"/>
     <w:uiPriority w:val="99"/>
     <w:unhideWhenUsed/>
     <w:rsid w:val="00AA1D8D"/>
@@ -2323,17 +2371,17 @@
       <w:spacing w:line="480" w:lineRule="auto"/>
     </w:pPr>
   </w:style>
-  <w:style w:type="character" w:customStyle="1" w:styleId="Textoindependiente2Car">
-    <w:name w:val="Texto independiente 2 Car"/>
-    <w:basedOn w:val="Fuentedeprrafopredeter"/>
-    <w:link w:val="Textoindependiente2"/>
+  <w:style w:type="character" w:customStyle="1" w:styleId="BodyText2Char">
+    <w:name w:val="Body Text 2 Char"/>
+    <w:basedOn w:val="DefaultParagraphFont"/>
+    <w:link w:val="BodyText2"/>
     <w:uiPriority w:val="99"/>
     <w:rsid w:val="00AA1D8D"/>
   </w:style>
-  <w:style w:type="paragraph" w:styleId="Textoindependiente3">
+  <w:style w:type="paragraph" w:styleId="BodyText3">
     <w:name w:val="Body Text 3"/>
     <w:basedOn w:val="Normal"/>
-    <w:link w:val="Textoindependiente3Car"/>
+    <w:link w:val="BodyText3Char"/>
     <w:uiPriority w:val="99"/>
     <w:unhideWhenUsed/>
     <w:rsid w:val="00AA1D8D"/>
@@ -2342,10 +2390,10 @@
       <w:szCs w:val="16"/>
     </w:rPr>
   </w:style>
-  <w:style w:type="character" w:customStyle="1" w:styleId="Textoindependiente3Car">
-    <w:name w:val="Texto independiente 3 Car"/>
-    <w:basedOn w:val="Fuentedeprrafopredeter"/>
-    <w:link w:val="Textoindependiente3"/>
+  <w:style w:type="character" w:customStyle="1" w:styleId="BodyText3Char">
+    <w:name w:val="Body Text 3 Char"/>
+    <w:basedOn w:val="DefaultParagraphFont"/>
+    <w:link w:val="BodyText3"/>
     <w:uiPriority w:val="99"/>
     <w:rsid w:val="00AA1D8D"/>
     <w:rPr>
@@ -2353,7 +2401,7 @@
       <w:szCs w:val="16"/>
     </w:rPr>
   </w:style>
-  <w:style w:type="paragraph" w:styleId="Lista">
+  <w:style w:type="paragraph" w:styleId="List">
     <w:name w:val="List"/>
     <w:basedOn w:val="Normal"/>
     <w:uiPriority w:val="99"/>
@@ -2364,7 +2412,7 @@
       <w:contextualSpacing/>
     </w:pPr>
   </w:style>
-  <w:style w:type="paragraph" w:styleId="Lista2">
+  <w:style w:type="paragraph" w:styleId="List2">
     <w:name w:val="List 2"/>
     <w:basedOn w:val="Normal"/>
     <w:uiPriority w:val="99"/>
@@ -2375,7 +2423,7 @@
       <w:contextualSpacing/>
     </w:pPr>
   </w:style>
-  <w:style w:type="paragraph" w:styleId="Lista3">
+  <w:style w:type="paragraph" w:styleId="List3">
     <w:name w:val="List 3"/>
     <w:basedOn w:val="Normal"/>
     <w:uiPriority w:val="99"/>
@@ -2386,7 +2434,7 @@
       <w:contextualSpacing/>
     </w:pPr>
   </w:style>
-  <w:style w:type="paragraph" w:styleId="Listaconvietas">
+  <w:style w:type="paragraph" w:styleId="ListBullet">
     <w:name w:val="List Bullet"/>
     <w:basedOn w:val="Normal"/>
     <w:uiPriority w:val="99"/>
@@ -2399,7 +2447,7 @@
       <w:contextualSpacing/>
     </w:pPr>
   </w:style>
-  <w:style w:type="paragraph" w:styleId="Listaconvietas2">
+  <w:style w:type="paragraph" w:styleId="ListBullet2">
     <w:name w:val="List Bullet 2"/>
     <w:basedOn w:val="Normal"/>
     <w:uiPriority w:val="99"/>
@@ -2412,7 +2460,7 @@
       <w:contextualSpacing/>
     </w:pPr>
   </w:style>
-  <w:style w:type="paragraph" w:styleId="Listaconvietas3">
+  <w:style w:type="paragraph" w:styleId="ListBullet3">
     <w:name w:val="List Bullet 3"/>
     <w:basedOn w:val="Normal"/>
     <w:uiPriority w:val="99"/>
@@ -2425,7 +2473,7 @@
       <w:contextualSpacing/>
     </w:pPr>
   </w:style>
-  <w:style w:type="paragraph" w:styleId="Listaconnmeros">
+  <w:style w:type="paragraph" w:styleId="ListNumber">
     <w:name w:val="List Number"/>
     <w:basedOn w:val="Normal"/>
     <w:uiPriority w:val="99"/>
@@ -2438,7 +2486,7 @@
       <w:contextualSpacing/>
     </w:pPr>
   </w:style>
-  <w:style w:type="paragraph" w:styleId="Listaconnmeros2">
+  <w:style w:type="paragraph" w:styleId="ListNumber2">
     <w:name w:val="List Number 2"/>
     <w:basedOn w:val="Normal"/>
     <w:uiPriority w:val="99"/>
@@ -2451,7 +2499,7 @@
       <w:contextualSpacing/>
     </w:pPr>
   </w:style>
-  <w:style w:type="paragraph" w:styleId="Listaconnmeros3">
+  <w:style w:type="paragraph" w:styleId="ListNumber3">
     <w:name w:val="List Number 3"/>
     <w:basedOn w:val="Normal"/>
     <w:uiPriority w:val="99"/>
@@ -2464,7 +2512,7 @@
       <w:contextualSpacing/>
     </w:pPr>
   </w:style>
-  <w:style w:type="paragraph" w:styleId="Continuarlista">
+  <w:style w:type="paragraph" w:styleId="ListContinue">
     <w:name w:val="List Continue"/>
     <w:basedOn w:val="Normal"/>
     <w:uiPriority w:val="99"/>
@@ -2475,7 +2523,7 @@
       <w:contextualSpacing/>
     </w:pPr>
   </w:style>
-  <w:style w:type="paragraph" w:styleId="Continuarlista2">
+  <w:style w:type="paragraph" w:styleId="ListContinue2">
     <w:name w:val="List Continue 2"/>
     <w:basedOn w:val="Normal"/>
     <w:uiPriority w:val="99"/>
@@ -2486,7 +2534,7 @@
       <w:contextualSpacing/>
     </w:pPr>
   </w:style>
-  <w:style w:type="paragraph" w:styleId="Continuarlista3">
+  <w:style w:type="paragraph" w:styleId="ListContinue3">
     <w:name w:val="List Continue 3"/>
     <w:basedOn w:val="Normal"/>
     <w:uiPriority w:val="99"/>
@@ -2497,9 +2545,9 @@
       <w:contextualSpacing/>
     </w:pPr>
   </w:style>
-  <w:style w:type="paragraph" w:styleId="Textomacro">
+  <w:style w:type="paragraph" w:styleId="MacroText">
     <w:name w:val="macro"/>
-    <w:link w:val="TextomacroCar"/>
+    <w:link w:val="MacroTextChar"/>
     <w:uiPriority w:val="99"/>
     <w:unhideWhenUsed/>
     <w:rsid w:val="0029639D"/>
@@ -2520,10 +2568,10 @@
       <w:szCs w:val="20"/>
     </w:rPr>
   </w:style>
-  <w:style w:type="character" w:customStyle="1" w:styleId="TextomacroCar">
-    <w:name w:val="Texto macro Car"/>
-    <w:basedOn w:val="Fuentedeprrafopredeter"/>
-    <w:link w:val="Textomacro"/>
+  <w:style w:type="character" w:customStyle="1" w:styleId="MacroTextChar">
+    <w:name w:val="Macro Text Char"/>
+    <w:basedOn w:val="DefaultParagraphFont"/>
+    <w:link w:val="MacroText"/>
     <w:uiPriority w:val="99"/>
     <w:rsid w:val="0029639D"/>
     <w:rPr>
@@ -2532,11 +2580,11 @@
       <w:szCs w:val="20"/>
     </w:rPr>
   </w:style>
-  <w:style w:type="paragraph" w:styleId="Cita">
+  <w:style w:type="paragraph" w:styleId="Quote">
     <w:name w:val="Quote"/>
     <w:basedOn w:val="Normal"/>
     <w:next w:val="Normal"/>
-    <w:link w:val="CitaCar"/>
+    <w:link w:val="QuoteChar"/>
     <w:uiPriority w:val="29"/>
     <w:qFormat/>
     <w:rsid w:val="00FC693F"/>
@@ -2546,10 +2594,10 @@
       <w:color w:val="000000" w:themeColor="text1"/>
     </w:rPr>
   </w:style>
-  <w:style w:type="character" w:customStyle="1" w:styleId="CitaCar">
-    <w:name w:val="Cita Car"/>
-    <w:basedOn w:val="Fuentedeprrafopredeter"/>
-    <w:link w:val="Cita"/>
+  <w:style w:type="character" w:customStyle="1" w:styleId="QuoteChar">
+    <w:name w:val="Quote Char"/>
+    <w:basedOn w:val="DefaultParagraphFont"/>
+    <w:link w:val="Quote"/>
     <w:uiPriority w:val="29"/>
     <w:rsid w:val="00FC693F"/>
     <w:rPr>
@@ -2558,10 +2606,10 @@
       <w:color w:val="000000" w:themeColor="text1"/>
     </w:rPr>
   </w:style>
-  <w:style w:type="character" w:customStyle="1" w:styleId="Ttulo4Car">
-    <w:name w:val="Título 4 Car"/>
-    <w:basedOn w:val="Fuentedeprrafopredeter"/>
-    <w:link w:val="Ttulo4"/>
+  <w:style w:type="character" w:customStyle="1" w:styleId="Heading4Char">
+    <w:name w:val="Heading 4 Char"/>
+    <w:basedOn w:val="DefaultParagraphFont"/>
+    <w:link w:val="Heading4"/>
     <w:uiPriority w:val="9"/>
     <w:semiHidden/>
     <w:rsid w:val="00FC693F"/>
@@ -2574,10 +2622,10 @@
       <w:color w:val="4F81BD" w:themeColor="accent1"/>
     </w:rPr>
   </w:style>
-  <w:style w:type="character" w:customStyle="1" w:styleId="Ttulo5Car">
-    <w:name w:val="Título 5 Car"/>
-    <w:basedOn w:val="Fuentedeprrafopredeter"/>
-    <w:link w:val="Ttulo5"/>
+  <w:style w:type="character" w:customStyle="1" w:styleId="Heading5Char">
+    <w:name w:val="Heading 5 Char"/>
+    <w:basedOn w:val="DefaultParagraphFont"/>
+    <w:link w:val="Heading5"/>
     <w:uiPriority w:val="9"/>
     <w:semiHidden/>
     <w:rsid w:val="00FC693F"/>
@@ -2586,10 +2634,10 @@
       <w:color w:val="243F60" w:themeColor="accent1" w:themeShade="7F"/>
     </w:rPr>
   </w:style>
-  <w:style w:type="character" w:customStyle="1" w:styleId="Ttulo6Car">
-    <w:name w:val="Título 6 Car"/>
-    <w:basedOn w:val="Fuentedeprrafopredeter"/>
-    <w:link w:val="Ttulo6"/>
+  <w:style w:type="character" w:customStyle="1" w:styleId="Heading6Char">
+    <w:name w:val="Heading 6 Char"/>
+    <w:basedOn w:val="DefaultParagraphFont"/>
+    <w:link w:val="Heading6"/>
     <w:uiPriority w:val="9"/>
     <w:semiHidden/>
     <w:rsid w:val="00FC693F"/>
@@ -2600,10 +2648,10 @@
       <w:color w:val="243F60" w:themeColor="accent1" w:themeShade="7F"/>
     </w:rPr>
   </w:style>
-  <w:style w:type="character" w:customStyle="1" w:styleId="Ttulo7Car">
-    <w:name w:val="Título 7 Car"/>
-    <w:basedOn w:val="Fuentedeprrafopredeter"/>
-    <w:link w:val="Ttulo7"/>
+  <w:style w:type="character" w:customStyle="1" w:styleId="Heading7Char">
+    <w:name w:val="Heading 7 Char"/>
+    <w:basedOn w:val="DefaultParagraphFont"/>
+    <w:link w:val="Heading7"/>
     <w:uiPriority w:val="9"/>
     <w:semiHidden/>
     <w:rsid w:val="00FC693F"/>
@@ -2614,10 +2662,10 @@
       <w:color w:val="404040" w:themeColor="text1" w:themeTint="BF"/>
     </w:rPr>
   </w:style>
-  <w:style w:type="character" w:customStyle="1" w:styleId="Ttulo8Car">
-    <w:name w:val="Título 8 Car"/>
-    <w:basedOn w:val="Fuentedeprrafopredeter"/>
-    <w:link w:val="Ttulo8"/>
+  <w:style w:type="character" w:customStyle="1" w:styleId="Heading8Char">
+    <w:name w:val="Heading 8 Char"/>
+    <w:basedOn w:val="DefaultParagraphFont"/>
+    <w:link w:val="Heading8"/>
     <w:uiPriority w:val="9"/>
     <w:semiHidden/>
     <w:rsid w:val="00FC693F"/>
@@ -2628,10 +2676,10 @@
       <w:szCs w:val="20"/>
     </w:rPr>
   </w:style>
-  <w:style w:type="character" w:customStyle="1" w:styleId="Ttulo9Car">
-    <w:name w:val="Título 9 Car"/>
-    <w:basedOn w:val="Fuentedeprrafopredeter"/>
-    <w:link w:val="Ttulo9"/>
+  <w:style w:type="character" w:customStyle="1" w:styleId="Heading9Char">
+    <w:name w:val="Heading 9 Char"/>
+    <w:basedOn w:val="DefaultParagraphFont"/>
+    <w:link w:val="Heading9"/>
     <w:uiPriority w:val="9"/>
     <w:semiHidden/>
     <w:rsid w:val="00FC693F"/>
@@ -2644,7 +2692,7 @@
       <w:szCs w:val="20"/>
     </w:rPr>
   </w:style>
-  <w:style w:type="paragraph" w:styleId="Descripcin">
+  <w:style w:type="paragraph" w:styleId="Caption">
     <w:name w:val="caption"/>
     <w:basedOn w:val="Normal"/>
     <w:next w:val="Normal"/>
@@ -2664,9 +2712,9 @@
       <w:szCs w:val="18"/>
     </w:rPr>
   </w:style>
-  <w:style w:type="character" w:styleId="Fuerte">
+  <w:style w:type="character" w:styleId="Strong">
     <w:name w:val="Strong"/>
-    <w:basedOn w:val="Fuentedeprrafopredeter"/>
+    <w:basedOn w:val="DefaultParagraphFont"/>
     <w:uiPriority w:val="22"/>
     <w:qFormat/>
     <w:rsid w:val="00FC693F"/>
@@ -2675,9 +2723,9 @@
       <w:bCs/>
     </w:rPr>
   </w:style>
-  <w:style w:type="character" w:styleId="nfasis">
+  <w:style w:type="character" w:styleId="Emphasis">
     <w:name w:val="Emphasis"/>
-    <w:basedOn w:val="Fuentedeprrafopredeter"/>
+    <w:basedOn w:val="DefaultParagraphFont"/>
     <w:uiPriority w:val="20"/>
     <w:qFormat/>
     <w:rsid w:val="00FC693F"/>
@@ -2686,11 +2734,11 @@
       <w:iCs/>
     </w:rPr>
   </w:style>
-  <w:style w:type="paragraph" w:styleId="Citadestacada">
+  <w:style w:type="paragraph" w:styleId="IntenseQuote">
     <w:name w:val="Intense Quote"/>
     <w:basedOn w:val="Normal"/>
     <w:next w:val="Normal"/>
-    <w:link w:val="CitadestacadaCar"/>
+    <w:link w:val="IntenseQuoteChar"/>
     <w:uiPriority w:val="30"/>
     <w:qFormat/>
     <w:rsid w:val="00FC693F"/>
@@ -2706,10 +2754,10 @@
       <w:color w:val="4F81BD" w:themeColor="accent1"/>
     </w:rPr>
   </w:style>
-  <w:style w:type="character" w:customStyle="1" w:styleId="CitadestacadaCar">
-    <w:name w:val="Cita destacada Car"/>
-    <w:basedOn w:val="Fuentedeprrafopredeter"/>
-    <w:link w:val="Citadestacada"/>
+  <w:style w:type="character" w:customStyle="1" w:styleId="IntenseQuoteChar">
+    <w:name w:val="Intense Quote Char"/>
+    <w:basedOn w:val="DefaultParagraphFont"/>
+    <w:link w:val="IntenseQuote"/>
     <w:uiPriority w:val="30"/>
     <w:rsid w:val="00FC693F"/>
     <w:rPr>
@@ -2720,9 +2768,9 @@
       <w:color w:val="4F81BD" w:themeColor="accent1"/>
     </w:rPr>
   </w:style>
-  <w:style w:type="character" w:styleId="nfasissutil">
+  <w:style w:type="character" w:styleId="SubtleEmphasis">
     <w:name w:val="Subtle Emphasis"/>
-    <w:basedOn w:val="Fuentedeprrafopredeter"/>
+    <w:basedOn w:val="DefaultParagraphFont"/>
     <w:uiPriority w:val="19"/>
     <w:qFormat/>
     <w:rsid w:val="00FC693F"/>
@@ -2732,9 +2780,9 @@
       <w:color w:val="808080" w:themeColor="text1" w:themeTint="7F"/>
     </w:rPr>
   </w:style>
-  <w:style w:type="character" w:styleId="nfasisintenso">
+  <w:style w:type="character" w:styleId="IntenseEmphasis">
     <w:name w:val="Intense Emphasis"/>
-    <w:basedOn w:val="Fuentedeprrafopredeter"/>
+    <w:basedOn w:val="DefaultParagraphFont"/>
     <w:uiPriority w:val="21"/>
     <w:qFormat/>
     <w:rsid w:val="00FC693F"/>
@@ -2746,9 +2794,9 @@
       <w:color w:val="4F81BD" w:themeColor="accent1"/>
     </w:rPr>
   </w:style>
-  <w:style w:type="character" w:styleId="Referenciasutil">
+  <w:style w:type="character" w:styleId="SubtleReference">
     <w:name w:val="Subtle Reference"/>
-    <w:basedOn w:val="Fuentedeprrafopredeter"/>
+    <w:basedOn w:val="DefaultParagraphFont"/>
     <w:uiPriority w:val="31"/>
     <w:qFormat/>
     <w:rsid w:val="00FC693F"/>
@@ -2758,9 +2806,9 @@
       <w:u w:val="single"/>
     </w:rPr>
   </w:style>
-  <w:style w:type="character" w:styleId="Referenciaintensa">
+  <w:style w:type="character" w:styleId="IntenseReference">
     <w:name w:val="Intense Reference"/>
-    <w:basedOn w:val="Fuentedeprrafopredeter"/>
+    <w:basedOn w:val="DefaultParagraphFont"/>
     <w:uiPriority w:val="32"/>
     <w:qFormat/>
     <w:rsid w:val="00FC693F"/>
@@ -2773,9 +2821,9 @@
       <w:u w:val="single"/>
     </w:rPr>
   </w:style>
-  <w:style w:type="character" w:styleId="Ttulodellibro">
+  <w:style w:type="character" w:styleId="BookTitle">
     <w:name w:val="Book Title"/>
-    <w:basedOn w:val="Fuentedeprrafopredeter"/>
+    <w:basedOn w:val="DefaultParagraphFont"/>
     <w:uiPriority w:val="33"/>
     <w:qFormat/>
     <w:rsid w:val="00FC693F"/>
@@ -2786,9 +2834,9 @@
       <w:spacing w:val="5"/>
     </w:rPr>
   </w:style>
-  <w:style w:type="paragraph" w:styleId="TtuloTDC">
+  <w:style w:type="paragraph" w:styleId="TOCHeading">
     <w:name w:val="TOC Heading"/>
-    <w:basedOn w:val="Ttulo1"/>
+    <w:basedOn w:val="Heading1"/>
     <w:next w:val="Normal"/>
     <w:uiPriority w:val="39"/>
     <w:semiHidden/>
@@ -2799,9 +2847,9 @@
       <w:outlineLvl w:val="9"/>
     </w:pPr>
   </w:style>
-  <w:style w:type="table" w:styleId="Tablaconcuadrcula">
+  <w:style w:type="table" w:styleId="TableGrid">
     <w:name w:val="Table Grid"/>
-    <w:basedOn w:val="Tablanormal"/>
+    <w:basedOn w:val="TableNormal"/>
     <w:uiPriority w:val="59"/>
     <w:rsid w:val="00FC693F"/>
     <w:pPr>
@@ -2818,9 +2866,9 @@
       </w:tblBorders>
     </w:tblPr>
   </w:style>
-  <w:style w:type="table" w:styleId="Sombreadoclaro">
+  <w:style w:type="table" w:styleId="LightShading">
     <w:name w:val="Light Shading"/>
-    <w:basedOn w:val="Tablanormal"/>
+    <w:basedOn w:val="TableNormal"/>
     <w:uiPriority w:val="60"/>
     <w:rsid w:val="00FC693F"/>
     <w:pPr>
@@ -2914,9 +2962,9 @@
       </w:tcPr>
     </w:tblStylePr>
   </w:style>
-  <w:style w:type="table" w:styleId="Sombreadoclaro-nfasis1">
+  <w:style w:type="table" w:styleId="LightShading-Accent1">
     <w:name w:val="Light Shading Accent 1"/>
-    <w:basedOn w:val="Tablanormal"/>
+    <w:basedOn w:val="TableNormal"/>
     <w:uiPriority w:val="60"/>
     <w:rsid w:val="00FC693F"/>
     <w:pPr>
@@ -3010,9 +3058,9 @@
       </w:tcPr>
     </w:tblStylePr>
   </w:style>
-  <w:style w:type="table" w:styleId="Sombreadoclaro-nfasis2">
+  <w:style w:type="table" w:styleId="LightShading-Accent2">
     <w:name w:val="Light Shading Accent 2"/>
-    <w:basedOn w:val="Tablanormal"/>
+    <w:basedOn w:val="TableNormal"/>
     <w:uiPriority w:val="60"/>
     <w:rsid w:val="00FC693F"/>
     <w:pPr>
@@ -3106,9 +3154,9 @@
       </w:tcPr>
     </w:tblStylePr>
   </w:style>
-  <w:style w:type="table" w:styleId="Sombreadoclaro-nfasis3">
+  <w:style w:type="table" w:styleId="LightShading-Accent3">
     <w:name w:val="Light Shading Accent 3"/>
-    <w:basedOn w:val="Tablanormal"/>
+    <w:basedOn w:val="TableNormal"/>
     <w:uiPriority w:val="60"/>
     <w:rsid w:val="00FC693F"/>
     <w:pPr>
@@ -3202,9 +3250,9 @@
       </w:tcPr>
     </w:tblStylePr>
   </w:style>
-  <w:style w:type="table" w:styleId="Sombreadoclaro-nfasis4">
+  <w:style w:type="table" w:styleId="LightShading-Accent4">
     <w:name w:val="Light Shading Accent 4"/>
-    <w:basedOn w:val="Tablanormal"/>
+    <w:basedOn w:val="TableNormal"/>
     <w:uiPriority w:val="60"/>
     <w:rsid w:val="00FC693F"/>
     <w:pPr>
@@ -3298,9 +3346,9 @@
       </w:tcPr>
     </w:tblStylePr>
   </w:style>
-  <w:style w:type="table" w:styleId="Sombreadoclaro-nfasis5">
+  <w:style w:type="table" w:styleId="LightShading-Accent5">
     <w:name w:val="Light Shading Accent 5"/>
-    <w:basedOn w:val="Tablanormal"/>
+    <w:basedOn w:val="TableNormal"/>
     <w:uiPriority w:val="60"/>
     <w:rsid w:val="00FC693F"/>
     <w:pPr>
@@ -3394,9 +3442,9 @@
       </w:tcPr>
     </w:tblStylePr>
   </w:style>
-  <w:style w:type="table" w:styleId="Sombreadoclaro-nfasis6">
+  <w:style w:type="table" w:styleId="LightShading-Accent6">
     <w:name w:val="Light Shading Accent 6"/>
-    <w:basedOn w:val="Tablanormal"/>
+    <w:basedOn w:val="TableNormal"/>
     <w:uiPriority w:val="60"/>
     <w:rsid w:val="00FC693F"/>
     <w:pPr>
@@ -3490,9 +3538,9 @@
       </w:tcPr>
     </w:tblStylePr>
   </w:style>
-  <w:style w:type="table" w:styleId="Listaclara">
+  <w:style w:type="table" w:styleId="LightList">
     <w:name w:val="Light List"/>
-    <w:basedOn w:val="Tablanormal"/>
+    <w:basedOn w:val="TableNormal"/>
     <w:uiPriority w:val="61"/>
     <w:rsid w:val="00FC693F"/>
     <w:pPr>
@@ -3575,9 +3623,9 @@
       </w:tcPr>
     </w:tblStylePr>
   </w:style>
-  <w:style w:type="table" w:styleId="Listaclara-nfasis1">
+  <w:style w:type="table" w:styleId="LightList-Accent1">
     <w:name w:val="Light List Accent 1"/>
-    <w:basedOn w:val="Tablanormal"/>
+    <w:basedOn w:val="TableNormal"/>
     <w:uiPriority w:val="61"/>
     <w:rsid w:val="00FC693F"/>
     <w:pPr>
@@ -3660,9 +3708,9 @@
       </w:tcPr>
     </w:tblStylePr>
   </w:style>
-  <w:style w:type="table" w:styleId="Listaclara-nfasis2">
+  <w:style w:type="table" w:styleId="LightList-Accent2">
     <w:name w:val="Light List Accent 2"/>
-    <w:basedOn w:val="Tablanormal"/>
+    <w:basedOn w:val="TableNormal"/>
     <w:uiPriority w:val="61"/>
     <w:rsid w:val="00CB0664"/>
     <w:pPr>
@@ -3745,9 +3793,9 @@
       </w:tcPr>
     </w:tblStylePr>
   </w:style>
-  <w:style w:type="table" w:styleId="Listaclara-nfasis3">
+  <w:style w:type="table" w:styleId="LightList-Accent3">
     <w:name w:val="Light List Accent 3"/>
-    <w:basedOn w:val="Tablanormal"/>
+    <w:basedOn w:val="TableNormal"/>
     <w:uiPriority w:val="61"/>
     <w:rsid w:val="00CB0664"/>
     <w:pPr>
@@ -3830,9 +3878,9 @@
       </w:tcPr>
     </w:tblStylePr>
   </w:style>
-  <w:style w:type="table" w:styleId="Listaclara-nfasis4">
+  <w:style w:type="table" w:styleId="LightList-Accent4">
     <w:name w:val="Light List Accent 4"/>
-    <w:basedOn w:val="Tablanormal"/>
+    <w:basedOn w:val="TableNormal"/>
     <w:uiPriority w:val="61"/>
     <w:rsid w:val="00CB0664"/>
     <w:pPr>
@@ -3915,9 +3963,9 @@
       </w:tcPr>
     </w:tblStylePr>
   </w:style>
-  <w:style w:type="table" w:styleId="Listaclara-nfasis5">
+  <w:style w:type="table" w:styleId="LightList-Accent5">
     <w:name w:val="Light List Accent 5"/>
-    <w:basedOn w:val="Tablanormal"/>
+    <w:basedOn w:val="TableNormal"/>
     <w:uiPriority w:val="61"/>
     <w:rsid w:val="00CB0664"/>
     <w:pPr>
@@ -4000,9 +4048,9 @@
       </w:tcPr>
     </w:tblStylePr>
   </w:style>
-  <w:style w:type="table" w:styleId="Listaclara-nfasis6">
+  <w:style w:type="table" w:styleId="LightList-Accent6">
     <w:name w:val="Light List Accent 6"/>
-    <w:basedOn w:val="Tablanormal"/>
+    <w:basedOn w:val="TableNormal"/>
     <w:uiPriority w:val="61"/>
     <w:rsid w:val="00CB0664"/>
     <w:pPr>
@@ -4085,9 +4133,9 @@
       </w:tcPr>
     </w:tblStylePr>
   </w:style>
-  <w:style w:type="table" w:styleId="Cuadrculaclara">
+  <w:style w:type="table" w:styleId="LightGrid">
     <w:name w:val="Light Grid"/>
-    <w:basedOn w:val="Tablanormal"/>
+    <w:basedOn w:val="TableNormal"/>
     <w:uiPriority w:val="62"/>
     <w:rsid w:val="00CB0664"/>
     <w:pPr>
@@ -4208,9 +4256,9 @@
       </w:tcPr>
     </w:tblStylePr>
   </w:style>
-  <w:style w:type="table" w:styleId="Cuadrculaclara-nfasis1">
+  <w:style w:type="table" w:styleId="LightGrid-Accent1">
     <w:name w:val="Light Grid Accent 1"/>
-    <w:basedOn w:val="Tablanormal"/>
+    <w:basedOn w:val="TableNormal"/>
     <w:uiPriority w:val="62"/>
     <w:rsid w:val="00CB0664"/>
     <w:pPr>
@@ -4331,9 +4379,9 @@
       </w:tcPr>
     </w:tblStylePr>
   </w:style>
-  <w:style w:type="table" w:styleId="Cuadrculaclara-nfasis2">
+  <w:style w:type="table" w:styleId="LightGrid-Accent2">
     <w:name w:val="Light Grid Accent 2"/>
-    <w:basedOn w:val="Tablanormal"/>
+    <w:basedOn w:val="TableNormal"/>
     <w:uiPriority w:val="62"/>
     <w:rsid w:val="00CB0664"/>
     <w:pPr>
@@ -4454,9 +4502,9 @@
       </w:tcPr>
     </w:tblStylePr>
   </w:style>
-  <w:style w:type="table" w:styleId="Cuadrculaclara-nfasis3">
+  <w:style w:type="table" w:styleId="LightGrid-Accent3">
     <w:name w:val="Light Grid Accent 3"/>
-    <w:basedOn w:val="Tablanormal"/>
+    <w:basedOn w:val="TableNormal"/>
     <w:uiPriority w:val="62"/>
     <w:rsid w:val="00CB0664"/>
     <w:pPr>
@@ -4577,9 +4625,9 @@
       </w:tcPr>
     </w:tblStylePr>
   </w:style>
-  <w:style w:type="table" w:styleId="Cuadrculaclara-nfasis4">
+  <w:style w:type="table" w:styleId="LightGrid-Accent4">
     <w:name w:val="Light Grid Accent 4"/>
-    <w:basedOn w:val="Tablanormal"/>
+    <w:basedOn w:val="TableNormal"/>
     <w:uiPriority w:val="62"/>
     <w:rsid w:val="00CB0664"/>
     <w:pPr>
@@ -4700,9 +4748,9 @@
       </w:tcPr>
     </w:tblStylePr>
   </w:style>
-  <w:style w:type="table" w:styleId="Cuadrculaclara-nfasis5">
+  <w:style w:type="table" w:styleId="LightGrid-Accent5">
     <w:name w:val="Light Grid Accent 5"/>
-    <w:basedOn w:val="Tablanormal"/>
+    <w:basedOn w:val="TableNormal"/>
     <w:uiPriority w:val="62"/>
     <w:rsid w:val="00CB0664"/>
     <w:pPr>
@@ -4823,9 +4871,9 @@
       </w:tcPr>
     </w:tblStylePr>
   </w:style>
-  <w:style w:type="table" w:styleId="Cuadrculaclara-nfasis6">
+  <w:style w:type="table" w:styleId="LightGrid-Accent6">
     <w:name w:val="Light Grid Accent 6"/>
-    <w:basedOn w:val="Tablanormal"/>
+    <w:basedOn w:val="TableNormal"/>
     <w:uiPriority w:val="62"/>
     <w:rsid w:val="00CB0664"/>
     <w:pPr>
@@ -4946,9 +4994,9 @@
       </w:tcPr>
     </w:tblStylePr>
   </w:style>
-  <w:style w:type="table" w:styleId="Sombreadomedio1">
+  <w:style w:type="table" w:styleId="MediumShading1">
     <w:name w:val="Medium Shading 1"/>
-    <w:basedOn w:val="Tablanormal"/>
+    <w:basedOn w:val="TableNormal"/>
     <w:uiPriority w:val="63"/>
     <w:rsid w:val="00CB0664"/>
     <w:pPr>
@@ -5045,9 +5093,9 @@
       </w:tcPr>
     </w:tblStylePr>
   </w:style>
-  <w:style w:type="table" w:styleId="Sombreadomedio1-nfasis1">
+  <w:style w:type="table" w:styleId="MediumShading1-Accent1">
     <w:name w:val="Medium Shading 1 Accent 1"/>
-    <w:basedOn w:val="Tablanormal"/>
+    <w:basedOn w:val="TableNormal"/>
     <w:uiPriority w:val="63"/>
     <w:rsid w:val="00CB0664"/>
     <w:pPr>
@@ -5144,9 +5192,9 @@
       </w:tcPr>
     </w:tblStylePr>
   </w:style>
-  <w:style w:type="table" w:styleId="Sombreadomedio1-nfasis2">
+  <w:style w:type="table" w:styleId="MediumShading1-Accent2">
     <w:name w:val="Medium Shading 1 Accent 2"/>
-    <w:basedOn w:val="Tablanormal"/>
+    <w:basedOn w:val="TableNormal"/>
     <w:uiPriority w:val="63"/>
     <w:rsid w:val="00CB0664"/>
     <w:pPr>
@@ -5243,9 +5291,9 @@
       </w:tcPr>
     </w:tblStylePr>
   </w:style>
-  <w:style w:type="table" w:styleId="Sombreadomedio1-nfasis3">
+  <w:style w:type="table" w:styleId="MediumShading1-Accent3">
     <w:name w:val="Medium Shading 1 Accent 3"/>
-    <w:basedOn w:val="Tablanormal"/>
+    <w:basedOn w:val="TableNormal"/>
     <w:uiPriority w:val="63"/>
     <w:rsid w:val="00CB0664"/>
     <w:pPr>
@@ -5342,9 +5390,9 @@
       </w:tcPr>
     </w:tblStylePr>
   </w:style>
-  <w:style w:type="table" w:styleId="Sombreadomedio1-nfasis4">
+  <w:style w:type="table" w:styleId="MediumShading1-Accent4">
     <w:name w:val="Medium Shading 1 Accent 4"/>
-    <w:basedOn w:val="Tablanormal"/>
+    <w:basedOn w:val="TableNormal"/>
     <w:uiPriority w:val="63"/>
     <w:rsid w:val="00CB0664"/>
     <w:pPr>
@@ -5441,9 +5489,9 @@
       </w:tcPr>
     </w:tblStylePr>
   </w:style>
-  <w:style w:type="table" w:styleId="Sombreadomedio1-nfasis5">
+  <w:style w:type="table" w:styleId="MediumShading1-Accent5">
     <w:name w:val="Medium Shading 1 Accent 5"/>
-    <w:basedOn w:val="Tablanormal"/>
+    <w:basedOn w:val="TableNormal"/>
     <w:uiPriority w:val="63"/>
     <w:rsid w:val="00CB0664"/>
     <w:pPr>
@@ -5540,9 +5588,9 @@
       </w:tcPr>
     </w:tblStylePr>
   </w:style>
-  <w:style w:type="table" w:styleId="Sombreadomedio1-nfasis6">
+  <w:style w:type="table" w:styleId="MediumShading1-Accent6">
     <w:name w:val="Medium Shading 1 Accent 6"/>
-    <w:basedOn w:val="Tablanormal"/>
+    <w:basedOn w:val="TableNormal"/>
     <w:uiPriority w:val="63"/>
     <w:rsid w:val="00CB0664"/>
     <w:pPr>
@@ -5639,9 +5687,9 @@
       </w:tcPr>
     </w:tblStylePr>
   </w:style>
-  <w:style w:type="table" w:styleId="Sombreadomedio2">
+  <w:style w:type="table" w:styleId="MediumShading2">
     <w:name w:val="Medium Shading 2"/>
-    <w:basedOn w:val="Tablanormal"/>
+    <w:basedOn w:val="TableNormal"/>
     <w:uiPriority w:val="64"/>
     <w:rsid w:val="00CB0664"/>
     <w:pPr>
@@ -5781,9 +5829,9 @@
       </w:tcPr>
     </w:tblStylePr>
   </w:style>
-  <w:style w:type="table" w:styleId="Sombreadomedio2-nfasis1">
+  <w:style w:type="table" w:styleId="MediumShading2-Accent1">
     <w:name w:val="Medium Shading 2 Accent 1"/>
-    <w:basedOn w:val="Tablanormal"/>
+    <w:basedOn w:val="TableNormal"/>
     <w:uiPriority w:val="64"/>
     <w:rsid w:val="00CB0664"/>
     <w:pPr>
@@ -5923,9 +5971,9 @@
       </w:tcPr>
     </w:tblStylePr>
   </w:style>
-  <w:style w:type="table" w:styleId="Sombreadomedio2-nfasis2">
+  <w:style w:type="table" w:styleId="MediumShading2-Accent2">
     <w:name w:val="Medium Shading 2 Accent 2"/>
-    <w:basedOn w:val="Tablanormal"/>
+    <w:basedOn w:val="TableNormal"/>
     <w:uiPriority w:val="64"/>
     <w:rsid w:val="00CB0664"/>
     <w:pPr>
@@ -6065,9 +6113,9 @@
       </w:tcPr>
     </w:tblStylePr>
   </w:style>
-  <w:style w:type="table" w:styleId="Sombreadomedio2-nfasis3">
+  <w:style w:type="table" w:styleId="MediumShading2-Accent3">
     <w:name w:val="Medium Shading 2 Accent 3"/>
-    <w:basedOn w:val="Tablanormal"/>
+    <w:basedOn w:val="TableNormal"/>
     <w:uiPriority w:val="64"/>
     <w:rsid w:val="00CB0664"/>
     <w:pPr>
@@ -6207,9 +6255,9 @@
       </w:tcPr>
     </w:tblStylePr>
   </w:style>
-  <w:style w:type="table" w:styleId="Sombreadomedio2-nfasis4">
+  <w:style w:type="table" w:styleId="MediumShading2-Accent4">
     <w:name w:val="Medium Shading 2 Accent 4"/>
-    <w:basedOn w:val="Tablanormal"/>
+    <w:basedOn w:val="TableNormal"/>
     <w:uiPriority w:val="64"/>
     <w:rsid w:val="00CB0664"/>
     <w:pPr>
@@ -6349,9 +6397,9 @@
       </w:tcPr>
     </w:tblStylePr>
   </w:style>
-  <w:style w:type="table" w:styleId="Sombreadomedio2-nfasis5">
+  <w:style w:type="table" w:styleId="MediumShading2-Accent5">
     <w:name w:val="Medium Shading 2 Accent 5"/>
-    <w:basedOn w:val="Tablanormal"/>
+    <w:basedOn w:val="TableNormal"/>
     <w:uiPriority w:val="64"/>
     <w:rsid w:val="00CB0664"/>
     <w:pPr>
@@ -6491,9 +6539,9 @@
       </w:tcPr>
     </w:tblStylePr>
   </w:style>
-  <w:style w:type="table" w:styleId="Sombreadomedio2-nfasis6">
+  <w:style w:type="table" w:styleId="MediumShading2-Accent6">
     <w:name w:val="Medium Shading 2 Accent 6"/>
-    <w:basedOn w:val="Tablanormal"/>
+    <w:basedOn w:val="TableNormal"/>
     <w:uiPriority w:val="64"/>
     <w:rsid w:val="00CB0664"/>
     <w:pPr>
@@ -6633,9 +6681,9 @@
       </w:tcPr>
     </w:tblStylePr>
   </w:style>
-  <w:style w:type="table" w:styleId="Listamedia1">
+  <w:style w:type="table" w:styleId="MediumList1">
     <w:name w:val="Medium List 1"/>
-    <w:basedOn w:val="Tablanormal"/>
+    <w:basedOn w:val="TableNormal"/>
     <w:uiPriority w:val="65"/>
     <w:rsid w:val="00CB0664"/>
     <w:pPr>
@@ -6710,9 +6758,9 @@
       </w:tcPr>
     </w:tblStylePr>
   </w:style>
-  <w:style w:type="table" w:styleId="Listamedia1-nfasis1">
+  <w:style w:type="table" w:styleId="MediumList1-Accent1">
     <w:name w:val="Medium List 1 Accent 1"/>
-    <w:basedOn w:val="Tablanormal"/>
+    <w:basedOn w:val="TableNormal"/>
     <w:uiPriority w:val="65"/>
     <w:rsid w:val="00CB0664"/>
     <w:pPr>
@@ -6787,9 +6835,9 @@
       </w:tcPr>
     </w:tblStylePr>
   </w:style>
-  <w:style w:type="table" w:styleId="Listamedia1-nfasis2">
+  <w:style w:type="table" w:styleId="MediumList1-Accent2">
     <w:name w:val="Medium List 1 Accent 2"/>
-    <w:basedOn w:val="Tablanormal"/>
+    <w:basedOn w:val="TableNormal"/>
     <w:uiPriority w:val="65"/>
     <w:rsid w:val="00CB0664"/>
     <w:pPr>
@@ -6864,9 +6912,9 @@
       </w:tcPr>
     </w:tblStylePr>
   </w:style>
-  <w:style w:type="table" w:styleId="Listamedia1-nfasis3">
+  <w:style w:type="table" w:styleId="MediumList1-Accent3">
     <w:name w:val="Medium List 1 Accent 3"/>
-    <w:basedOn w:val="Tablanormal"/>
+    <w:basedOn w:val="TableNormal"/>
     <w:uiPriority w:val="65"/>
     <w:rsid w:val="00CB0664"/>
     <w:pPr>
@@ -6941,9 +6989,9 @@
       </w:tcPr>
     </w:tblStylePr>
   </w:style>
-  <w:style w:type="table" w:styleId="Listamedia1-nfasis4">
+  <w:style w:type="table" w:styleId="MediumList1-Accent4">
     <w:name w:val="Medium List 1 Accent 4"/>
-    <w:basedOn w:val="Tablanormal"/>
+    <w:basedOn w:val="TableNormal"/>
     <w:uiPriority w:val="65"/>
     <w:rsid w:val="00CB0664"/>
     <w:pPr>
@@ -7018,9 +7066,9 @@
       </w:tcPr>
     </w:tblStylePr>
   </w:style>
-  <w:style w:type="table" w:styleId="Listamedia1-nfasis5">
+  <w:style w:type="table" w:styleId="MediumList1-Accent5">
     <w:name w:val="Medium List 1 Accent 5"/>
-    <w:basedOn w:val="Tablanormal"/>
+    <w:basedOn w:val="TableNormal"/>
     <w:uiPriority w:val="65"/>
     <w:rsid w:val="00CB0664"/>
     <w:pPr>
@@ -7095,9 +7143,9 @@
       </w:tcPr>
     </w:tblStylePr>
   </w:style>
-  <w:style w:type="table" w:styleId="Listamedia1-nfasis6">
+  <w:style w:type="table" w:styleId="MediumList1-Accent6">
     <w:name w:val="Medium List 1 Accent 6"/>
-    <w:basedOn w:val="Tablanormal"/>
+    <w:basedOn w:val="TableNormal"/>
     <w:uiPriority w:val="65"/>
     <w:rsid w:val="00CB0664"/>
     <w:pPr>
@@ -7172,9 +7220,9 @@
       </w:tcPr>
     </w:tblStylePr>
   </w:style>
-  <w:style w:type="table" w:styleId="Listamedia2">
+  <w:style w:type="table" w:styleId="MediumList2">
     <w:name w:val="Medium List 2"/>
-    <w:basedOn w:val="Tablanormal"/>
+    <w:basedOn w:val="TableNormal"/>
     <w:uiPriority w:val="66"/>
     <w:rsid w:val="00CB0664"/>
     <w:pPr>
@@ -7293,9 +7341,9 @@
       </w:tcPr>
     </w:tblStylePr>
   </w:style>
-  <w:style w:type="table" w:styleId="Listamedia2-nfasis1">
+  <w:style w:type="table" w:styleId="MediumList2-Accent1">
     <w:name w:val="Medium List 2 Accent 1"/>
-    <w:basedOn w:val="Tablanormal"/>
+    <w:basedOn w:val="TableNormal"/>
     <w:uiPriority w:val="66"/>
     <w:rsid w:val="00CB0664"/>
     <w:pPr>
@@ -7414,9 +7462,9 @@
       </w:tcPr>
     </w:tblStylePr>
   </w:style>
-  <w:style w:type="table" w:styleId="Listamedia2-nfasis2">
+  <w:style w:type="table" w:styleId="MediumList2-Accent2">
     <w:name w:val="Medium List 2 Accent 2"/>
-    <w:basedOn w:val="Tablanormal"/>
+    <w:basedOn w:val="TableNormal"/>
     <w:uiPriority w:val="66"/>
     <w:rsid w:val="00CB0664"/>
     <w:pPr>
@@ -7535,9 +7583,9 @@
       </w:tcPr>
     </w:tblStylePr>
   </w:style>
-  <w:style w:type="table" w:styleId="Listamedia2-nfasis3">
+  <w:style w:type="table" w:styleId="MediumList2-Accent3">
     <w:name w:val="Medium List 2 Accent 3"/>
-    <w:basedOn w:val="Tablanormal"/>
+    <w:basedOn w:val="TableNormal"/>
     <w:uiPriority w:val="66"/>
     <w:rsid w:val="00CB0664"/>
     <w:pPr>
@@ -7656,9 +7704,9 @@
       </w:tcPr>
     </w:tblStylePr>
   </w:style>
-  <w:style w:type="table" w:styleId="Listamedia2-nfasis4">
+  <w:style w:type="table" w:styleId="MediumList2-Accent4">
     <w:name w:val="Medium List 2 Accent 4"/>
-    <w:basedOn w:val="Tablanormal"/>
+    <w:basedOn w:val="TableNormal"/>
     <w:uiPriority w:val="66"/>
     <w:rsid w:val="00CB0664"/>
     <w:pPr>
@@ -7777,9 +7825,9 @@
       </w:tcPr>
     </w:tblStylePr>
   </w:style>
-  <w:style w:type="table" w:styleId="Listamedia2-nfasis5">
+  <w:style w:type="table" w:styleId="MediumList2-Accent5">
     <w:name w:val="Medium List 2 Accent 5"/>
-    <w:basedOn w:val="Tablanormal"/>
+    <w:basedOn w:val="TableNormal"/>
     <w:uiPriority w:val="66"/>
     <w:rsid w:val="00CB0664"/>
     <w:pPr>
@@ -7898,9 +7946,9 @@
       </w:tcPr>
     </w:tblStylePr>
   </w:style>
-  <w:style w:type="table" w:styleId="Listamedia2-nfasis6">
+  <w:style w:type="table" w:styleId="MediumList2-Accent6">
     <w:name w:val="Medium List 2 Accent 6"/>
-    <w:basedOn w:val="Tablanormal"/>
+    <w:basedOn w:val="TableNormal"/>
     <w:uiPriority w:val="66"/>
     <w:rsid w:val="00CB0664"/>
     <w:pPr>
@@ -8019,9 +8067,9 @@
       </w:tcPr>
     </w:tblStylePr>
   </w:style>
-  <w:style w:type="table" w:styleId="Cuadrculamedia1">
+  <w:style w:type="table" w:styleId="MediumGrid1">
     <w:name w:val="Medium Grid 1"/>
-    <w:basedOn w:val="Tablanormal"/>
+    <w:basedOn w:val="TableNormal"/>
     <w:uiPriority w:val="67"/>
     <w:rsid w:val="00CB0664"/>
     <w:pPr>
@@ -8085,9 +8133,9 @@
       </w:tcPr>
     </w:tblStylePr>
   </w:style>
-  <w:style w:type="table" w:styleId="Cuadrculamedia1-nfasis1">
+  <w:style w:type="table" w:styleId="MediumGrid1-Accent1">
     <w:name w:val="Medium Grid 1 Accent 1"/>
-    <w:basedOn w:val="Tablanormal"/>
+    <w:basedOn w:val="TableNormal"/>
     <w:uiPriority w:val="67"/>
     <w:rsid w:val="00CB0664"/>
     <w:pPr>
@@ -8151,9 +8199,9 @@
       </w:tcPr>
     </w:tblStylePr>
   </w:style>
-  <w:style w:type="table" w:styleId="Cuadrculamedia1-nfasis2">
+  <w:style w:type="table" w:styleId="MediumGrid1-Accent2">
     <w:name w:val="Medium Grid 1 Accent 2"/>
-    <w:basedOn w:val="Tablanormal"/>
+    <w:basedOn w:val="TableNormal"/>
     <w:uiPriority w:val="67"/>
     <w:rsid w:val="00CB0664"/>
     <w:pPr>
@@ -8217,9 +8265,9 @@
       </w:tcPr>
     </w:tblStylePr>
   </w:style>
-  <w:style w:type="table" w:styleId="Cuadrculamedia1-nfasis3">
+  <w:style w:type="table" w:styleId="MediumGrid1-Accent3">
     <w:name w:val="Medium Grid 1 Accent 3"/>
-    <w:basedOn w:val="Tablanormal"/>
+    <w:basedOn w:val="TableNormal"/>
     <w:uiPriority w:val="67"/>
     <w:rsid w:val="00CB0664"/>
     <w:pPr>
@@ -8283,9 +8331,9 @@
       </w:tcPr>
     </w:tblStylePr>
   </w:style>
-  <w:style w:type="table" w:styleId="Cuadrculamedia1-nfasis4">
+  <w:style w:type="table" w:styleId="MediumGrid1-Accent4">
     <w:name w:val="Medium Grid 1 Accent 4"/>
-    <w:basedOn w:val="Tablanormal"/>
+    <w:basedOn w:val="TableNormal"/>
     <w:uiPriority w:val="67"/>
     <w:rsid w:val="00CB0664"/>
     <w:pPr>
@@ -8349,9 +8397,9 @@
       </w:tcPr>
     </w:tblStylePr>
   </w:style>
-  <w:style w:type="table" w:styleId="Cuadrculamedia1-nfasis5">
+  <w:style w:type="table" w:styleId="MediumGrid1-Accent5">
     <w:name w:val="Medium Grid 1 Accent 5"/>
-    <w:basedOn w:val="Tablanormal"/>
+    <w:basedOn w:val="TableNormal"/>
     <w:uiPriority w:val="67"/>
     <w:rsid w:val="00CB0664"/>
     <w:pPr>
@@ -8415,9 +8463,9 @@
       </w:tcPr>
     </w:tblStylePr>
   </w:style>
-  <w:style w:type="table" w:styleId="Cuadrculamedia1-nfasis6">
+  <w:style w:type="table" w:styleId="MediumGrid1-Accent6">
     <w:name w:val="Medium Grid 1 Accent 6"/>
-    <w:basedOn w:val="Tablanormal"/>
+    <w:basedOn w:val="TableNormal"/>
     <w:uiPriority w:val="67"/>
     <w:rsid w:val="00CB0664"/>
     <w:pPr>
@@ -8481,9 +8529,9 @@
       </w:tcPr>
     </w:tblStylePr>
   </w:style>
-  <w:style w:type="table" w:styleId="Cuadrculamedia2">
+  <w:style w:type="table" w:styleId="MediumGrid2">
     <w:name w:val="Medium Grid 2"/>
-    <w:basedOn w:val="Tablanormal"/>
+    <w:basedOn w:val="TableNormal"/>
     <w:uiPriority w:val="68"/>
     <w:rsid w:val="00CB0664"/>
     <w:pPr>
@@ -8599,9 +8647,9 @@
       </w:tcPr>
     </w:tblStylePr>
   </w:style>
-  <w:style w:type="table" w:styleId="Cuadrculamedia2-nfasis1">
+  <w:style w:type="table" w:styleId="MediumGrid2-Accent1">
     <w:name w:val="Medium Grid 2 Accent 1"/>
-    <w:basedOn w:val="Tablanormal"/>
+    <w:basedOn w:val="TableNormal"/>
     <w:uiPriority w:val="68"/>
     <w:rsid w:val="00CB0664"/>
     <w:pPr>
@@ -8717,9 +8765,9 @@
       </w:tcPr>
     </w:tblStylePr>
   </w:style>
-  <w:style w:type="table" w:styleId="Cuadrculamedia2-nfasis2">
+  <w:style w:type="table" w:styleId="MediumGrid2-Accent2">
     <w:name w:val="Medium Grid 2 Accent 2"/>
-    <w:basedOn w:val="Tablanormal"/>
+    <w:basedOn w:val="TableNormal"/>
     <w:uiPriority w:val="68"/>
     <w:rsid w:val="00CB0664"/>
     <w:pPr>
@@ -8835,9 +8883,9 @@
       </w:tcPr>
     </w:tblStylePr>
   </w:style>
-  <w:style w:type="table" w:styleId="Cuadrculamedia2-nfasis3">
+  <w:style w:type="table" w:styleId="MediumGrid2-Accent3">
     <w:name w:val="Medium Grid 2 Accent 3"/>
-    <w:basedOn w:val="Tablanormal"/>
+    <w:basedOn w:val="TableNormal"/>
     <w:uiPriority w:val="68"/>
     <w:rsid w:val="00CB0664"/>
     <w:pPr>
@@ -8953,9 +9001,9 @@
       </w:tcPr>
     </w:tblStylePr>
   </w:style>
-  <w:style w:type="table" w:styleId="Cuadrculamedia2-nfasis4">
+  <w:style w:type="table" w:styleId="MediumGrid2-Accent4">
     <w:name w:val="Medium Grid 2 Accent 4"/>
-    <w:basedOn w:val="Tablanormal"/>
+    <w:basedOn w:val="TableNormal"/>
     <w:uiPriority w:val="68"/>
     <w:rsid w:val="00CB0664"/>
     <w:pPr>
@@ -9071,9 +9119,9 @@
       </w:tcPr>
     </w:tblStylePr>
   </w:style>
-  <w:style w:type="table" w:styleId="Cuadrculamedia2-nfasis5">
+  <w:style w:type="table" w:styleId="MediumGrid2-Accent5">
     <w:name w:val="Medium Grid 2 Accent 5"/>
-    <w:basedOn w:val="Tablanormal"/>
+    <w:basedOn w:val="TableNormal"/>
     <w:uiPriority w:val="68"/>
     <w:rsid w:val="00CB0664"/>
     <w:pPr>
@@ -9189,9 +9237,9 @@
       </w:tcPr>
     </w:tblStylePr>
   </w:style>
-  <w:style w:type="table" w:styleId="Cuadrculamedia2-nfasis6">
+  <w:style w:type="table" w:styleId="MediumGrid2-Accent6">
     <w:name w:val="Medium Grid 2 Accent 6"/>
-    <w:basedOn w:val="Tablanormal"/>
+    <w:basedOn w:val="TableNormal"/>
     <w:uiPriority w:val="68"/>
     <w:rsid w:val="00CB0664"/>
     <w:pPr>
@@ -9307,9 +9355,9 @@
       </w:tcPr>
     </w:tblStylePr>
   </w:style>
-  <w:style w:type="table" w:styleId="Cuadrculamedia3">
+  <w:style w:type="table" w:styleId="MediumGrid3">
     <w:name w:val="Medium Grid 3"/>
-    <w:basedOn w:val="Tablanormal"/>
+    <w:basedOn w:val="TableNormal"/>
     <w:uiPriority w:val="69"/>
     <w:rsid w:val="00CB0664"/>
     <w:pPr>
@@ -9441,9 +9489,9 @@
       </w:tcPr>
     </w:tblStylePr>
   </w:style>
-  <w:style w:type="table" w:styleId="Cuadrculamedia3-nfasis1">
+  <w:style w:type="table" w:styleId="MediumGrid3-Accent1">
     <w:name w:val="Medium Grid 3 Accent 1"/>
-    <w:basedOn w:val="Tablanormal"/>
+    <w:basedOn w:val="TableNormal"/>
     <w:uiPriority w:val="69"/>
     <w:rsid w:val="00CB0664"/>
     <w:pPr>
@@ -9575,9 +9623,9 @@
       </w:tcPr>
     </w:tblStylePr>
   </w:style>
-  <w:style w:type="table" w:styleId="Cuadrculamedia3-nfasis2">
+  <w:style w:type="table" w:styleId="MediumGrid3-Accent2">
     <w:name w:val="Medium Grid 3 Accent 2"/>
-    <w:basedOn w:val="Tablanormal"/>
+    <w:basedOn w:val="TableNormal"/>
     <w:uiPriority w:val="69"/>
     <w:rsid w:val="00CB0664"/>
     <w:pPr>
@@ -9709,9 +9757,9 @@
       </w:tcPr>
     </w:tblStylePr>
   </w:style>
-  <w:style w:type="table" w:styleId="Cuadrculamedia3-nfasis3">
+  <w:style w:type="table" w:styleId="MediumGrid3-Accent3">
     <w:name w:val="Medium Grid 3 Accent 3"/>
-    <w:basedOn w:val="Tablanormal"/>
+    <w:basedOn w:val="TableNormal"/>
     <w:uiPriority w:val="69"/>
     <w:rsid w:val="00CB0664"/>
     <w:pPr>
@@ -9843,9 +9891,9 @@
       </w:tcPr>
     </w:tblStylePr>
   </w:style>
-  <w:style w:type="table" w:styleId="Cuadrculamedia3-nfasis4">
+  <w:style w:type="table" w:styleId="MediumGrid3-Accent4">
     <w:name w:val="Medium Grid 3 Accent 4"/>
-    <w:basedOn w:val="Tablanormal"/>
+    <w:basedOn w:val="TableNormal"/>
     <w:uiPriority w:val="69"/>
     <w:rsid w:val="00CB0664"/>
     <w:pPr>
@@ -9977,9 +10025,9 @@
       </w:tcPr>
     </w:tblStylePr>
   </w:style>
-  <w:style w:type="table" w:styleId="Cuadrculamedia3-nfasis5">
+  <w:style w:type="table" w:styleId="MediumGrid3-Accent5">
     <w:name w:val="Medium Grid 3 Accent 5"/>
-    <w:basedOn w:val="Tablanormal"/>
+    <w:basedOn w:val="TableNormal"/>
     <w:uiPriority w:val="69"/>
     <w:rsid w:val="00CB0664"/>
     <w:pPr>
@@ -10111,9 +10159,9 @@
       </w:tcPr>
     </w:tblStylePr>
   </w:style>
-  <w:style w:type="table" w:styleId="Cuadrculamedia3-nfasis6">
+  <w:style w:type="table" w:styleId="MediumGrid3-Accent6">
     <w:name w:val="Medium Grid 3 Accent 6"/>
-    <w:basedOn w:val="Tablanormal"/>
+    <w:basedOn w:val="TableNormal"/>
     <w:uiPriority w:val="69"/>
     <w:rsid w:val="00CB0664"/>
     <w:pPr>
@@ -10245,9 +10293,9 @@
       </w:tcPr>
     </w:tblStylePr>
   </w:style>
-  <w:style w:type="table" w:styleId="Listaoscura">
+  <w:style w:type="table" w:styleId="DarkList">
     <w:name w:val="Dark List"/>
-    <w:basedOn w:val="Tablanormal"/>
+    <w:basedOn w:val="TableNormal"/>
     <w:uiPriority w:val="70"/>
     <w:rsid w:val="00CB0664"/>
     <w:pPr>
@@ -10352,9 +10400,9 @@
       </w:tcPr>
     </w:tblStylePr>
   </w:style>
-  <w:style w:type="table" w:styleId="Listaoscura-nfasis1">
+  <w:style w:type="table" w:styleId="DarkList-Accent1">
     <w:name w:val="Dark List Accent 1"/>
-    <w:basedOn w:val="Tablanormal"/>
+    <w:basedOn w:val="TableNormal"/>
     <w:uiPriority w:val="70"/>
     <w:rsid w:val="00CB0664"/>
     <w:pPr>
@@ -10459,9 +10507,9 @@
       </w:tcPr>
     </w:tblStylePr>
   </w:style>
-  <w:style w:type="table" w:styleId="Listaoscura-nfasis2">
+  <w:style w:type="table" w:styleId="DarkList-Accent2">
     <w:name w:val="Dark List Accent 2"/>
-    <w:basedOn w:val="Tablanormal"/>
+    <w:basedOn w:val="TableNormal"/>
     <w:uiPriority w:val="70"/>
     <w:rsid w:val="00CB0664"/>
     <w:pPr>
@@ -10566,9 +10614,9 @@
       </w:tcPr>
     </w:tblStylePr>
   </w:style>
-  <w:style w:type="table" w:styleId="Listaoscura-nfasis3">
+  <w:style w:type="table" w:styleId="DarkList-Accent3">
     <w:name w:val="Dark List Accent 3"/>
-    <w:basedOn w:val="Tablanormal"/>
+    <w:basedOn w:val="TableNormal"/>
     <w:uiPriority w:val="70"/>
     <w:rsid w:val="00CB0664"/>
     <w:pPr>
@@ -10673,9 +10721,9 @@
       </w:tcPr>
     </w:tblStylePr>
   </w:style>
-  <w:style w:type="table" w:styleId="Listaoscura-nfasis4">
+  <w:style w:type="table" w:styleId="DarkList-Accent4">
     <w:name w:val="Dark List Accent 4"/>
-    <w:basedOn w:val="Tablanormal"/>
+    <w:basedOn w:val="TableNormal"/>
     <w:uiPriority w:val="70"/>
     <w:rsid w:val="00CB0664"/>
     <w:pPr>
@@ -10780,9 +10828,9 @@
       </w:tcPr>
     </w:tblStylePr>
   </w:style>
-  <w:style w:type="table" w:styleId="Listaoscura-nfasis5">
+  <w:style w:type="table" w:styleId="DarkList-Accent5">
     <w:name w:val="Dark List Accent 5"/>
-    <w:basedOn w:val="Tablanormal"/>
+    <w:basedOn w:val="TableNormal"/>
     <w:uiPriority w:val="70"/>
     <w:rsid w:val="00CB0664"/>
     <w:pPr>
@@ -10887,9 +10935,9 @@
       </w:tcPr>
     </w:tblStylePr>
   </w:style>
-  <w:style w:type="table" w:styleId="Listaoscura-nfasis6">
+  <w:style w:type="table" w:styleId="DarkList-Accent6">
     <w:name w:val="Dark List Accent 6"/>
-    <w:basedOn w:val="Tablanormal"/>
+    <w:basedOn w:val="TableNormal"/>
     <w:uiPriority w:val="70"/>
     <w:rsid w:val="00CB0664"/>
     <w:pPr>
@@ -10994,9 +11042,9 @@
       </w:tcPr>
     </w:tblStylePr>
   </w:style>
-  <w:style w:type="table" w:styleId="Sombreadovistoso">
+  <w:style w:type="table" w:styleId="ColorfulShading">
     <w:name w:val="Colorful Shading"/>
-    <w:basedOn w:val="Tablanormal"/>
+    <w:basedOn w:val="TableNormal"/>
     <w:uiPriority w:val="71"/>
     <w:rsid w:val="00CB0664"/>
     <w:pPr>
@@ -11109,9 +11157,9 @@
       </w:rPr>
     </w:tblStylePr>
   </w:style>
-  <w:style w:type="table" w:styleId="Sombreadovistoso-nfasis1">
+  <w:style w:type="table" w:styleId="ColorfulShading-Accent1">
     <w:name w:val="Colorful Shading Accent 1"/>
-    <w:basedOn w:val="Tablanormal"/>
+    <w:basedOn w:val="TableNormal"/>
     <w:uiPriority w:val="71"/>
     <w:rsid w:val="00CB0664"/>
     <w:pPr>
@@ -11224,9 +11272,9 @@
       </w:rPr>
     </w:tblStylePr>
   </w:style>
-  <w:style w:type="table" w:styleId="Sombreadovistoso-nfasis2">
+  <w:style w:type="table" w:styleId="ColorfulShading-Accent2">
     <w:name w:val="Colorful Shading Accent 2"/>
-    <w:basedOn w:val="Tablanormal"/>
+    <w:basedOn w:val="TableNormal"/>
     <w:uiPriority w:val="71"/>
     <w:rsid w:val="00CB0664"/>
     <w:pPr>
@@ -11339,9 +11387,9 @@
       </w:rPr>
     </w:tblStylePr>
   </w:style>
-  <w:style w:type="table" w:styleId="Sombreadovistoso-nfasis3">
+  <w:style w:type="table" w:styleId="ColorfulShading-Accent3">
     <w:name w:val="Colorful Shading Accent 3"/>
-    <w:basedOn w:val="Tablanormal"/>
+    <w:basedOn w:val="TableNormal"/>
     <w:uiPriority w:val="71"/>
     <w:rsid w:val="00CB0664"/>
     <w:pPr>
@@ -11444,9 +11492,9 @@
       </w:tcPr>
     </w:tblStylePr>
   </w:style>
-  <w:style w:type="table" w:styleId="Sombreadovistoso-nfasis4">
+  <w:style w:type="table" w:styleId="ColorfulShading-Accent4">
     <w:name w:val="Colorful Shading Accent 4"/>
-    <w:basedOn w:val="Tablanormal"/>
+    <w:basedOn w:val="TableNormal"/>
     <w:uiPriority w:val="71"/>
     <w:rsid w:val="00CB0664"/>
     <w:pPr>
@@ -11559,9 +11607,9 @@
       </w:rPr>
     </w:tblStylePr>
   </w:style>
-  <w:style w:type="table" w:styleId="Sombreadovistoso-nfasis5">
+  <w:style w:type="table" w:styleId="ColorfulShading-Accent5">
     <w:name w:val="Colorful Shading Accent 5"/>
-    <w:basedOn w:val="Tablanormal"/>
+    <w:basedOn w:val="TableNormal"/>
     <w:uiPriority w:val="71"/>
     <w:rsid w:val="00CB0664"/>
     <w:pPr>
@@ -11674,9 +11722,9 @@
       </w:rPr>
     </w:tblStylePr>
   </w:style>
-  <w:style w:type="table" w:styleId="Sombreadovistoso-nfasis6">
+  <w:style w:type="table" w:styleId="ColorfulShading-Accent6">
     <w:name w:val="Colorful Shading Accent 6"/>
-    <w:basedOn w:val="Tablanormal"/>
+    <w:basedOn w:val="TableNormal"/>
     <w:uiPriority w:val="71"/>
     <w:rsid w:val="00CB0664"/>
     <w:pPr>
@@ -11789,9 +11837,9 @@
       </w:rPr>
     </w:tblStylePr>
   </w:style>
-  <w:style w:type="table" w:styleId="Listavistosa">
+  <w:style w:type="table" w:styleId="ColorfulList">
     <w:name w:val="Colorful List"/>
-    <w:basedOn w:val="Tablanormal"/>
+    <w:basedOn w:val="TableNormal"/>
     <w:uiPriority w:val="72"/>
     <w:rsid w:val="00CB0664"/>
     <w:pPr>
@@ -11868,9 +11916,9 @@
       </w:tcPr>
     </w:tblStylePr>
   </w:style>
-  <w:style w:type="table" w:styleId="Listavistosa-nfasis1">
+  <w:style w:type="table" w:styleId="ColorfulList-Accent1">
     <w:name w:val="Colorful List Accent 1"/>
-    <w:basedOn w:val="Tablanormal"/>
+    <w:basedOn w:val="TableNormal"/>
     <w:uiPriority w:val="72"/>
     <w:rsid w:val="00CB0664"/>
     <w:pPr>
@@ -11947,9 +11995,9 @@
       </w:tcPr>
     </w:tblStylePr>
   </w:style>
-  <w:style w:type="table" w:styleId="Listavistosa-nfasis2">
+  <w:style w:type="table" w:styleId="ColorfulList-Accent2">
     <w:name w:val="Colorful List Accent 2"/>
-    <w:basedOn w:val="Tablanormal"/>
+    <w:basedOn w:val="TableNormal"/>
     <w:uiPriority w:val="72"/>
     <w:rsid w:val="00CB0664"/>
     <w:pPr>
@@ -12026,9 +12074,9 @@
       </w:tcPr>
     </w:tblStylePr>
   </w:style>
-  <w:style w:type="table" w:styleId="Listavistosa-nfasis3">
+  <w:style w:type="table" w:styleId="ColorfulList-Accent3">
     <w:name w:val="Colorful List Accent 3"/>
-    <w:basedOn w:val="Tablanormal"/>
+    <w:basedOn w:val="TableNormal"/>
     <w:uiPriority w:val="72"/>
     <w:rsid w:val="00CB0664"/>
     <w:pPr>
@@ -12105,9 +12153,9 @@
       </w:tcPr>
     </w:tblStylePr>
   </w:style>
-  <w:style w:type="table" w:styleId="Listavistosa-nfasis4">
+  <w:style w:type="table" w:styleId="ColorfulList-Accent4">
     <w:name w:val="Colorful List Accent 4"/>
-    <w:basedOn w:val="Tablanormal"/>
+    <w:basedOn w:val="TableNormal"/>
     <w:uiPriority w:val="72"/>
     <w:rsid w:val="00CB0664"/>
     <w:pPr>
@@ -12184,9 +12232,9 @@
       </w:tcPr>
     </w:tblStylePr>
   </w:style>
-  <w:style w:type="table" w:styleId="Listavistosa-nfasis5">
+  <w:style w:type="table" w:styleId="ColorfulList-Accent5">
     <w:name w:val="Colorful List Accent 5"/>
-    <w:basedOn w:val="Tablanormal"/>
+    <w:basedOn w:val="TableNormal"/>
     <w:uiPriority w:val="72"/>
     <w:rsid w:val="00CB0664"/>
     <w:pPr>
@@ -12263,9 +12311,9 @@
       </w:tcPr>
     </w:tblStylePr>
   </w:style>
-  <w:style w:type="table" w:styleId="Listavistosa-nfasis6">
+  <w:style w:type="table" w:styleId="ColorfulList-Accent6">
     <w:name w:val="Colorful List Accent 6"/>
-    <w:basedOn w:val="Tablanormal"/>
+    <w:basedOn w:val="TableNormal"/>
     <w:uiPriority w:val="72"/>
     <w:rsid w:val="00CB0664"/>
     <w:pPr>
@@ -12342,9 +12390,9 @@
       </w:tcPr>
     </w:tblStylePr>
   </w:style>
-  <w:style w:type="table" w:styleId="Cuadrculavistosa">
+  <w:style w:type="table" w:styleId="ColorfulGrid">
     <w:name w:val="Colorful Grid"/>
-    <w:basedOn w:val="Tablanormal"/>
+    <w:basedOn w:val="TableNormal"/>
     <w:uiPriority w:val="73"/>
     <w:rsid w:val="00CB0664"/>
     <w:pPr>
@@ -12415,9 +12463,9 @@
       </w:tcPr>
     </w:tblStylePr>
   </w:style>
-  <w:style w:type="table" w:styleId="Cuadrculavistosa-nfasis1">
+  <w:style w:type="table" w:styleId="ColorfulGrid-Accent1">
     <w:name w:val="Colorful Grid Accent 1"/>
-    <w:basedOn w:val="Tablanormal"/>
+    <w:basedOn w:val="TableNormal"/>
     <w:uiPriority w:val="73"/>
     <w:rsid w:val="00CB0664"/>
     <w:pPr>
@@ -12488,9 +12536,9 @@
       </w:tcPr>
     </w:tblStylePr>
   </w:style>
-  <w:style w:type="table" w:styleId="Cuadrculavistosa-nfasis2">
+  <w:style w:type="table" w:styleId="ColorfulGrid-Accent2">
     <w:name w:val="Colorful Grid Accent 2"/>
-    <w:basedOn w:val="Tablanormal"/>
+    <w:basedOn w:val="TableNormal"/>
     <w:uiPriority w:val="73"/>
     <w:rsid w:val="00CB0664"/>
     <w:pPr>
@@ -12561,9 +12609,9 @@
       </w:tcPr>
     </w:tblStylePr>
   </w:style>
-  <w:style w:type="table" w:styleId="Cuadrculavistosa-nfasis3">
+  <w:style w:type="table" w:styleId="ColorfulGrid-Accent3">
     <w:name w:val="Colorful Grid Accent 3"/>
-    <w:basedOn w:val="Tablanormal"/>
+    <w:basedOn w:val="TableNormal"/>
     <w:uiPriority w:val="73"/>
     <w:rsid w:val="00CB0664"/>
     <w:pPr>
@@ -12634,9 +12682,9 @@
       </w:tcPr>
     </w:tblStylePr>
   </w:style>
-  <w:style w:type="table" w:styleId="Cuadrculavistosa-nfasis4">
+  <w:style w:type="table" w:styleId="ColorfulGrid-Accent4">
     <w:name w:val="Colorful Grid Accent 4"/>
-    <w:basedOn w:val="Tablanormal"/>
+    <w:basedOn w:val="TableNormal"/>
     <w:uiPriority w:val="73"/>
     <w:rsid w:val="00CB0664"/>
     <w:pPr>
@@ -12707,9 +12755,9 @@
       </w:tcPr>
     </w:tblStylePr>
   </w:style>
-  <w:style w:type="table" w:styleId="Cuadrculavistosa-nfasis5">
+  <w:style w:type="table" w:styleId="ColorfulGrid-Accent5">
     <w:name w:val="Colorful Grid Accent 5"/>
-    <w:basedOn w:val="Tablanormal"/>
+    <w:basedOn w:val="TableNormal"/>
     <w:uiPriority w:val="73"/>
     <w:rsid w:val="00CB0664"/>
     <w:pPr>
@@ -12780,9 +12828,9 @@
       </w:tcPr>
     </w:tblStylePr>
   </w:style>
-  <w:style w:type="table" w:styleId="Cuadrculavistosa-nfasis6">
+  <w:style w:type="table" w:styleId="ColorfulGrid-Accent6">
     <w:name w:val="Colorful Grid Accent 6"/>
-    <w:basedOn w:val="Tablanormal"/>
+    <w:basedOn w:val="TableNormal"/>
     <w:uiPriority w:val="73"/>
     <w:rsid w:val="00CB0664"/>
     <w:pPr>

</xml_diff>